<commit_message>
Black text in Installationsvejledning
</commit_message>
<xml_diff>
--- a/Documentation/Official Documentation/Installationsvejledning for IBOS Nodelæser version 4.0.0.0.docx
+++ b/Documentation/Official Documentation/Installationsvejledning for IBOS Nodelæser version 4.0.0.0.docx
@@ -6,47 +6,62 @@
       <w:pPr>
         <w:pStyle w:val="Titel"/>
         <w:spacing w:before="240" w:after="120"/>
-        <w:rPr/>
-      </w:pPr>
-      <w:r>
-        <w:rPr/>
+        <w:rPr>
+          <w:color w:val="000000"/>
+        </w:rPr>
+      </w:pPr>
+      <w:r>
+        <w:rPr>
+          <w:color w:val="000000"/>
+        </w:rPr>
         <w:t>Installationsvejledning for</w:t>
       </w:r>
     </w:p>
     <w:p>
       <w:pPr>
         <w:pStyle w:val="Titel"/>
-        <w:rPr/>
+        <w:rPr>
+          <w:color w:val="000000"/>
+        </w:rPr>
       </w:pPr>
       <w:r>
         <w:rPr>
           <w:rFonts w:eastAsia="Arial" w:cs="Arial"/>
+          <w:color w:val="000000"/>
         </w:rPr>
         <w:t xml:space="preserve"> </w:t>
       </w:r>
       <w:r>
-        <w:rPr/>
+        <w:rPr>
+          <w:color w:val="000000"/>
+        </w:rPr>
         <w:t xml:space="preserve">"IBOS Nodelæser </w:t>
       </w:r>
       <w:r>
         <w:rPr>
-          <w:color w:val="C9211E"/>
+          <w:color w:val="000000"/>
           <w:lang w:val="da-DK"/>
         </w:rPr>
         <w:t>4</w:t>
       </w:r>
       <w:r>
-        <w:rPr/>
+        <w:rPr>
+          <w:color w:val="000000"/>
+        </w:rPr>
         <w:t xml:space="preserve">.0.0.0" </w:t>
       </w:r>
     </w:p>
     <w:p>
       <w:pPr>
         <w:pStyle w:val="Normal"/>
-        <w:rPr/>
-      </w:pPr>
-      <w:r>
-        <w:rPr/>
+        <w:rPr>
+          <w:color w:val="000000"/>
+        </w:rPr>
+      </w:pPr>
+      <w:r>
+        <w:rPr>
+          <w:color w:val="000000"/>
+        </w:rPr>
       </w:r>
     </w:p>
     <w:sdt>
@@ -243,6 +258,7 @@
         <w:pStyle w:val="Normal"/>
         <w:rPr>
           <w:rFonts w:ascii="Calibri" w:hAnsi="Calibri" w:eastAsia="Times New Roman" w:cs="Times New Roman"/>
+          <w:color w:val="000000"/>
           <w:kern w:val="0"/>
           <w:sz w:val="22"/>
           <w:szCs w:val="22"/>
@@ -252,6 +268,7 @@
       <w:r>
         <w:rPr>
           <w:rFonts w:eastAsia="Times New Roman" w:cs="Times New Roman" w:ascii="Calibri" w:hAnsi="Calibri"/>
+          <w:color w:val="000000"/>
           <w:kern w:val="0"/>
           <w:sz w:val="22"/>
           <w:szCs w:val="22"/>
@@ -262,10 +279,14 @@
     <w:p>
       <w:pPr>
         <w:pStyle w:val="Normal"/>
-        <w:rPr/>
-      </w:pPr>
-      <w:r>
-        <w:rPr/>
+        <w:rPr>
+          <w:color w:val="000000"/>
+        </w:rPr>
+      </w:pPr>
+      <w:r>
+        <w:rPr>
+          <w:color w:val="000000"/>
+        </w:rPr>
       </w:r>
     </w:p>
     <w:p>
@@ -275,56 +296,70 @@
           <w:ilvl w:val="0"/>
           <w:numId w:val="2"/>
         </w:numPr>
-        <w:rPr/>
+        <w:rPr>
+          <w:color w:val="000000"/>
+        </w:rPr>
       </w:pPr>
       <w:bookmarkStart w:id="0" w:name="__RefHeading___Toc531010032"/>
       <w:bookmarkEnd w:id="0"/>
       <w:r>
-        <w:rPr/>
+        <w:rPr>
+          <w:color w:val="000000"/>
+        </w:rPr>
         <w:t>Systemkrav</w:t>
       </w:r>
     </w:p>
     <w:p>
       <w:pPr>
         <w:pStyle w:val="Normal"/>
-        <w:rPr/>
-      </w:pPr>
-      <w:r>
-        <w:rPr/>
-      </w:r>
-    </w:p>
-    <w:p>
-      <w:pPr>
-        <w:pStyle w:val="Normal"/>
-        <w:rPr/>
-      </w:pPr>
-      <w:r>
-        <w:rPr/>
+        <w:rPr>
+          <w:color w:val="000000"/>
+        </w:rPr>
+      </w:pPr>
+      <w:r>
+        <w:rPr>
+          <w:color w:val="000000"/>
+        </w:rPr>
+      </w:r>
+    </w:p>
+    <w:p>
+      <w:pPr>
+        <w:pStyle w:val="Normal"/>
+        <w:rPr>
+          <w:color w:val="000000"/>
+        </w:rPr>
+      </w:pPr>
+      <w:r>
+        <w:rPr>
+          <w:color w:val="000000"/>
+        </w:rPr>
         <w:t xml:space="preserve">IBOS Nodelæser </w:t>
       </w:r>
       <w:r>
         <w:rPr>
-          <w:color w:val="C9211E"/>
+          <w:color w:val="000000"/>
         </w:rPr>
         <w:t>Version 4.0.0.0</w:t>
       </w:r>
       <w:r>
-        <w:rPr/>
-        <w:t xml:space="preserve"> </w:t>
-      </w:r>
-      <w:r>
-        <w:rPr/>
-        <w:t>er primært testet med</w:t>
+        <w:rPr>
+          <w:color w:val="000000"/>
+        </w:rPr>
+        <w:t xml:space="preserve"> er primært testet med</w:t>
       </w:r>
     </w:p>
     <w:p>
       <w:pPr>
         <w:pStyle w:val="Normal"/>
         <w:ind w:left="720" w:hanging="0"/>
-        <w:rPr/>
-      </w:pPr>
-      <w:r>
-        <w:rPr/>
+        <w:rPr>
+          <w:color w:val="000000"/>
+        </w:rPr>
+      </w:pPr>
+      <w:r>
+        <w:rPr>
+          <w:color w:val="000000"/>
+        </w:rPr>
       </w:r>
     </w:p>
     <w:p>
@@ -334,10 +369,14 @@
           <w:ilvl w:val="0"/>
           <w:numId w:val="3"/>
         </w:numPr>
-        <w:rPr/>
-      </w:pPr>
-      <w:r>
-        <w:rPr/>
+        <w:rPr>
+          <w:color w:val="000000"/>
+        </w:rPr>
+      </w:pPr>
+      <w:r>
+        <w:rPr>
+          <w:color w:val="000000"/>
+        </w:rPr>
         <w:t>Windows 10</w:t>
       </w:r>
     </w:p>
@@ -348,15 +387,19 @@
           <w:ilvl w:val="0"/>
           <w:numId w:val="3"/>
         </w:numPr>
-        <w:rPr/>
-      </w:pPr>
-      <w:r>
-        <w:rPr/>
+        <w:rPr>
+          <w:color w:val="000000"/>
+        </w:rPr>
+      </w:pPr>
+      <w:r>
+        <w:rPr>
+          <w:color w:val="000000"/>
+        </w:rPr>
         <w:t xml:space="preserve">JAWS </w:t>
       </w:r>
       <w:r>
         <w:rPr>
-          <w:color w:val="C9211E"/>
+          <w:color w:val="000000"/>
         </w:rPr>
         <w:t>2018</w:t>
       </w:r>
@@ -368,20 +411,28 @@
           <w:ilvl w:val="0"/>
           <w:numId w:val="3"/>
         </w:numPr>
-        <w:rPr/>
-      </w:pPr>
-      <w:r>
-        <w:rPr/>
+        <w:rPr>
+          <w:color w:val="000000"/>
+        </w:rPr>
+      </w:pPr>
+      <w:r>
+        <w:rPr>
+          <w:color w:val="000000"/>
+        </w:rPr>
         <w:t>Braille display af typerne:</w:t>
       </w:r>
     </w:p>
     <w:p>
       <w:pPr>
         <w:pStyle w:val="Normal"/>
-        <w:rPr/>
-      </w:pPr>
-      <w:r>
-        <w:rPr/>
+        <w:rPr>
+          <w:color w:val="000000"/>
+        </w:rPr>
+      </w:pPr>
+      <w:r>
+        <w:rPr>
+          <w:color w:val="000000"/>
+        </w:rPr>
         <w:tab/>
         <w:t>"Humanware Braillant",</w:t>
       </w:r>
@@ -389,16 +440,21 @@
     <w:p>
       <w:pPr>
         <w:pStyle w:val="Normal"/>
-        <w:rPr/>
+        <w:rPr>
+          <w:color w:val="000000"/>
+        </w:rPr>
       </w:pPr>
       <w:r>
         <w:rPr>
           <w:rFonts w:eastAsia="Times New Roman"/>
+          <w:color w:val="000000"/>
         </w:rPr>
         <w:t xml:space="preserve">     </w:t>
       </w:r>
       <w:r>
-        <w:rPr/>
+        <w:rPr>
+          <w:color w:val="000000"/>
+        </w:rPr>
         <w:tab/>
         <w:t>"Freedom Scientific FOCUS 14"</w:t>
       </w:r>
@@ -406,87 +462,121 @@
     <w:p>
       <w:pPr>
         <w:pStyle w:val="Normal"/>
-        <w:rPr/>
-      </w:pPr>
-      <w:r>
-        <w:rPr/>
-      </w:r>
-    </w:p>
-    <w:p>
-      <w:pPr>
-        <w:pStyle w:val="Normal"/>
-        <w:rPr/>
-      </w:pPr>
-      <w:r>
-        <w:rPr/>
+        <w:rPr>
+          <w:color w:val="000000"/>
+        </w:rPr>
+      </w:pPr>
+      <w:r>
+        <w:rPr>
+          <w:color w:val="000000"/>
+        </w:rPr>
+      </w:r>
+    </w:p>
+    <w:p>
+      <w:pPr>
+        <w:pStyle w:val="Normal"/>
+        <w:rPr>
+          <w:color w:val="000000"/>
+        </w:rPr>
+      </w:pPr>
+      <w:r>
+        <w:rPr>
+          <w:color w:val="000000"/>
+        </w:rPr>
         <w:t>Programmet vil sandsynligvis også fungere med andre versioner af Windows, JAWS og med de fleste andre Braille Displays. Men dette er ikke grundigt testet!</w:t>
       </w:r>
     </w:p>
     <w:p>
       <w:pPr>
         <w:pStyle w:val="Normal"/>
-        <w:rPr/>
-      </w:pPr>
-      <w:r>
-        <w:rPr/>
-      </w:r>
-    </w:p>
-    <w:p>
-      <w:pPr>
-        <w:pStyle w:val="Normal"/>
-        <w:rPr/>
-      </w:pPr>
-      <w:r>
-        <w:rPr/>
+        <w:rPr>
+          <w:color w:val="000000"/>
+        </w:rPr>
+      </w:pPr>
+      <w:r>
+        <w:rPr>
+          <w:color w:val="000000"/>
+        </w:rPr>
+      </w:r>
+    </w:p>
+    <w:p>
+      <w:pPr>
+        <w:pStyle w:val="Normal"/>
+        <w:rPr>
+          <w:color w:val="000000"/>
+        </w:rPr>
+      </w:pPr>
+      <w:r>
+        <w:rPr>
+          <w:color w:val="000000"/>
+        </w:rPr>
         <w:t>Til demonstrationsformål, primært for seende</w:t>
       </w:r>
       <w:r>
         <w:rPr>
+          <w:color w:val="000000"/>
           <w:lang w:val="da-DK"/>
         </w:rPr>
         <w:t>,</w:t>
       </w:r>
       <w:r>
-        <w:rPr/>
+        <w:rPr>
+          <w:color w:val="000000"/>
+        </w:rPr>
         <w:t xml:space="preserve"> vil programmet også kunne afvikles uden JAWS og Braille display, men en meget stor del af funktionaliteten vil naturligvis ikke være tilgængelig.</w:t>
       </w:r>
     </w:p>
     <w:p>
       <w:pPr>
         <w:pStyle w:val="Normal"/>
-        <w:rPr/>
-      </w:pPr>
-      <w:r>
-        <w:rPr/>
-      </w:r>
-    </w:p>
-    <w:p>
-      <w:pPr>
-        <w:pStyle w:val="Normal"/>
-        <w:rPr/>
-      </w:pPr>
-      <w:r>
-        <w:rPr/>
+        <w:rPr>
+          <w:color w:val="000000"/>
+        </w:rPr>
+      </w:pPr>
+      <w:r>
+        <w:rPr>
+          <w:color w:val="000000"/>
+        </w:rPr>
+      </w:r>
+    </w:p>
+    <w:p>
+      <w:pPr>
+        <w:pStyle w:val="Normal"/>
+        <w:rPr>
+          <w:color w:val="000000"/>
+        </w:rPr>
+      </w:pPr>
+      <w:r>
+        <w:rPr>
+          <w:color w:val="000000"/>
+        </w:rPr>
         <w:t xml:space="preserve">IBOS Nodelæser forudsætter at brugeren </w:t>
       </w:r>
       <w:r>
         <w:rPr>
+          <w:color w:val="000000"/>
           <w:lang w:val="da-DK"/>
         </w:rPr>
         <w:t>kan</w:t>
       </w:r>
       <w:r>
-        <w:rPr/>
+        <w:rPr>
+          <w:color w:val="000000"/>
+        </w:rPr>
         <w:t xml:space="preserve"> manøvrere rundt i et almindeligt Windows-program, og er fortrolig med følgende Windows Forms kontroller:</w:t>
       </w:r>
     </w:p>
     <w:p>
       <w:pPr>
         <w:pStyle w:val="Normal"/>
-        <w:rPr/>
-      </w:pPr>
-      <w:r>
-        <w:rPr/>
+        <w:rPr>
+          <w:color w:val="000000"/>
+        </w:rPr>
+      </w:pPr>
+      <w:r>
+        <w:rPr>
+          <w:color w:val="000000"/>
+        </w:rPr>
       </w:r>
     </w:p>
     <w:p>
@@ -496,10 +586,14 @@
           <w:ilvl w:val="0"/>
           <w:numId w:val="4"/>
         </w:numPr>
-        <w:rPr/>
-      </w:pPr>
-      <w:r>
-        <w:rPr/>
+        <w:rPr>
+          <w:color w:val="000000"/>
+        </w:rPr>
+      </w:pPr>
+      <w:r>
+        <w:rPr>
+          <w:color w:val="000000"/>
+        </w:rPr>
         <w:t>Menulinie</w:t>
       </w:r>
     </w:p>
@@ -510,10 +604,14 @@
           <w:ilvl w:val="0"/>
           <w:numId w:val="4"/>
         </w:numPr>
-        <w:rPr/>
-      </w:pPr>
-      <w:r>
-        <w:rPr/>
+        <w:rPr>
+          <w:color w:val="000000"/>
+        </w:rPr>
+      </w:pPr>
+      <w:r>
+        <w:rPr>
+          <w:color w:val="000000"/>
+        </w:rPr>
         <w:t>"Åbn"  dialog</w:t>
       </w:r>
     </w:p>
@@ -524,10 +622,14 @@
           <w:ilvl w:val="0"/>
           <w:numId w:val="4"/>
         </w:numPr>
-        <w:rPr/>
-      </w:pPr>
-      <w:r>
-        <w:rPr/>
+        <w:rPr>
+          <w:color w:val="000000"/>
+        </w:rPr>
+      </w:pPr>
+      <w:r>
+        <w:rPr>
+          <w:color w:val="000000"/>
+        </w:rPr>
         <w:t>Listevisning</w:t>
       </w:r>
     </w:p>
@@ -538,29 +640,41 @@
           <w:ilvl w:val="0"/>
           <w:numId w:val="4"/>
         </w:numPr>
-        <w:rPr/>
-      </w:pPr>
-      <w:r>
-        <w:rPr/>
+        <w:rPr>
+          <w:color w:val="000000"/>
+        </w:rPr>
+      </w:pPr>
+      <w:r>
+        <w:rPr>
+          <w:color w:val="000000"/>
+        </w:rPr>
         <w:t>Trævisning med checkboxe.</w:t>
       </w:r>
     </w:p>
     <w:p>
       <w:pPr>
         <w:pStyle w:val="Normal"/>
-        <w:rPr/>
-      </w:pPr>
-      <w:r>
-        <w:rPr/>
-      </w:r>
-    </w:p>
-    <w:p>
-      <w:pPr>
-        <w:pStyle w:val="Normal"/>
-        <w:rPr/>
-      </w:pPr>
-      <w:r>
-        <w:rPr/>
+        <w:rPr>
+          <w:color w:val="000000"/>
+        </w:rPr>
+      </w:pPr>
+      <w:r>
+        <w:rPr>
+          <w:color w:val="000000"/>
+        </w:rPr>
+      </w:r>
+    </w:p>
+    <w:p>
+      <w:pPr>
+        <w:pStyle w:val="Normal"/>
+        <w:rPr>
+          <w:color w:val="000000"/>
+        </w:rPr>
+      </w:pPr>
+      <w:r>
+        <w:rPr>
+          <w:color w:val="000000"/>
+        </w:rPr>
       </w:r>
       <w:r>
         <w:br w:type="page"/>
@@ -569,10 +683,14 @@
     <w:p>
       <w:pPr>
         <w:pStyle w:val="Normal"/>
-        <w:rPr/>
-      </w:pPr>
-      <w:r>
-        <w:rPr/>
+        <w:rPr>
+          <w:color w:val="000000"/>
+        </w:rPr>
+      </w:pPr>
+      <w:r>
+        <w:rPr>
+          <w:color w:val="000000"/>
+        </w:rPr>
       </w:r>
     </w:p>
     <w:p>
@@ -582,35 +700,48 @@
           <w:ilvl w:val="0"/>
           <w:numId w:val="2"/>
         </w:numPr>
-        <w:rPr/>
+        <w:rPr>
+          <w:color w:val="000000"/>
+        </w:rPr>
       </w:pPr>
       <w:bookmarkStart w:id="1" w:name="__RefHeading___Toc531010033"/>
       <w:bookmarkEnd w:id="1"/>
       <w:r>
-        <w:rPr/>
+        <w:rPr>
+          <w:color w:val="000000"/>
+        </w:rPr>
         <w:t>Distribution af IBOS Nodelæser</w:t>
       </w:r>
     </w:p>
     <w:p>
       <w:pPr>
         <w:pStyle w:val="Brdtekst"/>
-        <w:rPr/>
-      </w:pPr>
-      <w:r>
-        <w:rPr/>
+        <w:rPr>
+          <w:color w:val="000000"/>
+        </w:rPr>
+      </w:pPr>
+      <w:r>
+        <w:rPr>
+          <w:color w:val="000000"/>
+        </w:rPr>
       </w:r>
     </w:p>
     <w:p>
       <w:pPr>
         <w:pStyle w:val="Brdtekst"/>
-        <w:rPr/>
-      </w:pPr>
-      <w:r>
-        <w:rPr/>
+        <w:rPr>
+          <w:color w:val="000000"/>
+        </w:rPr>
+      </w:pPr>
+      <w:r>
+        <w:rPr>
+          <w:color w:val="000000"/>
+        </w:rPr>
         <w:t>IBOS Nodelæser distribueres i distributionsfilen</w:t>
       </w:r>
       <w:r>
         <w:rPr>
+          <w:color w:val="000000"/>
           <w:shd w:fill="FFFFFF" w:val="clear"/>
         </w:rPr>
         <w:t xml:space="preserve"> </w:t>
@@ -619,6 +750,7 @@
         <w:rPr>
           <w:b/>
           <w:bCs/>
+          <w:color w:val="000000"/>
           <w:shd w:fill="FFFFFF" w:val="clear"/>
         </w:rPr>
         <w:t>"IBOS MusicXmlReader.</w:t>
@@ -627,7 +759,7 @@
         <w:rPr>
           <w:b/>
           <w:bCs/>
-          <w:color w:val="C9211E"/>
+          <w:color w:val="000000"/>
           <w:shd w:fill="FFFFFF" w:val="clear"/>
           <w:lang w:val="da-DK"/>
         </w:rPr>
@@ -637,6 +769,7 @@
         <w:rPr>
           <w:b/>
           <w:bCs/>
+          <w:color w:val="000000"/>
           <w:shd w:fill="FFFFFF" w:val="clear"/>
         </w:rPr>
         <w:t>.0.0.0.zip"</w:t>
@@ -646,11 +779,13 @@
       <w:pPr>
         <w:pStyle w:val="Brdtekst"/>
         <w:rPr>
+          <w:color w:val="000000"/>
           <w:highlight w:val="white"/>
         </w:rPr>
       </w:pPr>
       <w:r>
         <w:rPr>
+          <w:color w:val="000000"/>
           <w:highlight w:val="white"/>
         </w:rPr>
       </w:r>
@@ -658,16 +793,20 @@
     <w:p>
       <w:pPr>
         <w:pStyle w:val="Brdtekst"/>
-        <w:rPr/>
-      </w:pPr>
-      <w:r>
-        <w:rPr>
+        <w:rPr>
+          <w:color w:val="000000"/>
+        </w:rPr>
+      </w:pPr>
+      <w:r>
+        <w:rPr>
+          <w:color w:val="000000"/>
           <w:shd w:fill="FFFFFF" w:val="clear"/>
         </w:rPr>
         <w:t>Hvis distributionsfilen distribue</w:t>
       </w:r>
       <w:r>
         <w:rPr>
+          <w:color w:val="000000"/>
           <w:shd w:fill="FFFFFF" w:val="clear"/>
           <w:lang w:val="da-DK"/>
         </w:rPr>
@@ -675,6 +814,7 @@
       </w:r>
       <w:r>
         <w:rPr>
+          <w:color w:val="000000"/>
           <w:shd w:fill="FFFFFF" w:val="clear"/>
         </w:rPr>
         <w:t>s som et link til en hjemmeside og linket ikke virker umiddelbart skal linket blot  kopieres til den benyttede Web-browsers adresselinie, hvorefter det aktiveres ved et tryk på "Return"</w:t>
@@ -689,12 +829,14 @@
       </w:pPr>
       <w:r>
         <w:rPr>
+          <w:color w:val="000000"/>
           <w:shd w:fill="FFFFFF" w:val="clear"/>
         </w:rPr>
         <w:t xml:space="preserve">Distributionsfilen indeholder </w:t>
       </w:r>
       <w:r>
         <w:rPr>
+          <w:color w:val="000000"/>
           <w:shd w:fill="FFFFFF" w:val="clear"/>
           <w:lang w:val="da-DK"/>
         </w:rPr>
@@ -702,6 +844,7 @@
       </w:r>
       <w:r>
         <w:rPr>
+          <w:color w:val="000000"/>
           <w:shd w:fill="FFFFFF" w:val="clear"/>
         </w:rPr>
         <w:t>samt selve installationsfilen:</w:t>
@@ -710,12 +853,15 @@
     <w:p>
       <w:pPr>
         <w:pStyle w:val="Brdtekst"/>
-        <w:rPr/>
+        <w:rPr>
+          <w:color w:val="000000"/>
+        </w:rPr>
       </w:pPr>
       <w:r>
         <w:rPr>
           <w:b/>
           <w:bCs/>
+          <w:color w:val="000000"/>
           <w:shd w:fill="FFFFFF" w:val="clear"/>
         </w:rPr>
         <w:t>"IBOS MusicXmlReader.</w:t>
@@ -724,7 +870,7 @@
         <w:rPr>
           <w:b/>
           <w:bCs/>
-          <w:color w:val="C9211E"/>
+          <w:color w:val="000000"/>
           <w:shd w:fill="FFFFFF" w:val="clear"/>
           <w:lang w:val="da-DK"/>
         </w:rPr>
@@ -734,6 +880,7 @@
         <w:rPr>
           <w:b/>
           <w:bCs/>
+          <w:color w:val="000000"/>
           <w:shd w:fill="FFFFFF" w:val="clear"/>
         </w:rPr>
         <w:t>.0.0.0.Setup.exe"</w:t>
@@ -751,6 +898,7 @@
       </w:pPr>
       <w:r>
         <w:rPr>
+          <w:color w:val="000000"/>
           <w:highlight w:val="white"/>
         </w:rPr>
         <w:t>Når distributionsfilen er hentet og udpakket kan man gå videre med selve installationsprocessen:</w:t>
@@ -771,6 +919,7 @@
       <w:bookmarkEnd w:id="2"/>
       <w:r>
         <w:rPr>
+          <w:color w:val="000000"/>
           <w:highlight w:val="white"/>
         </w:rPr>
         <w:t>Installation af IBOS Nodelæser</w:t>
@@ -779,16 +928,21 @@
     <w:p>
       <w:pPr>
         <w:pStyle w:val="Brdtekst"/>
-        <w:rPr/>
-      </w:pPr>
-      <w:r>
-        <w:rPr/>
+        <w:rPr>
+          <w:color w:val="000000"/>
+        </w:rPr>
+      </w:pPr>
+      <w:r>
+        <w:rPr>
+          <w:color w:val="000000"/>
+        </w:rPr>
         <w:t>Start  "</w:t>
       </w:r>
       <w:r>
         <w:rPr>
           <w:b/>
           <w:bCs/>
+          <w:color w:val="000000"/>
           <w:shd w:fill="FFFFFF" w:val="clear"/>
         </w:rPr>
         <w:t>IBOS MusicXmlReader.</w:t>
@@ -797,7 +951,7 @@
         <w:rPr>
           <w:b/>
           <w:bCs/>
-          <w:color w:val="C9211E"/>
+          <w:color w:val="000000"/>
           <w:shd w:fill="FFFFFF" w:val="clear"/>
           <w:lang w:val="da-DK"/>
         </w:rPr>
@@ -807,16 +961,20 @@
         <w:rPr>
           <w:b/>
           <w:bCs/>
+          <w:color w:val="000000"/>
           <w:shd w:fill="FFFFFF" w:val="clear"/>
         </w:rPr>
         <w:t>.0.0.0.Setup.exe"</w:t>
       </w:r>
       <w:r>
-        <w:rPr/>
+        <w:rPr>
+          <w:color w:val="000000"/>
+        </w:rPr>
         <w:t xml:space="preserve"> og acceptér de foreslåede valg</w:t>
       </w:r>
       <w:r>
         <w:rPr>
+          <w:color w:val="000000"/>
           <w:lang w:val="da-DK"/>
         </w:rPr>
         <w:t xml:space="preserve"> i dialogboksene der vises under installationen. </w:t>
@@ -831,6 +989,7 @@
       </w:pPr>
       <w:r>
         <w:rPr>
+          <w:color w:val="000000"/>
           <w:lang w:val="da-DK"/>
         </w:rPr>
         <w:t>Bemærk at dialogboksene kan oplæses med JAWS kommandoen INSERT + B ligesom defaultknappen i dialogboksen kan oplæses med INSERT + E.</w:t>
@@ -840,11 +999,13 @@
       <w:pPr>
         <w:pStyle w:val="Brdtekst"/>
         <w:rPr>
+          <w:color w:val="000000"/>
           <w:lang w:val="da-DK"/>
         </w:rPr>
       </w:pPr>
       <w:r>
         <w:rPr>
+          <w:color w:val="000000"/>
           <w:lang w:val="da-DK"/>
         </w:rPr>
       </w:r>
@@ -852,39 +1013,54 @@
     <w:p>
       <w:pPr>
         <w:pStyle w:val="Brdtekst"/>
-        <w:rPr/>
-      </w:pPr>
-      <w:r>
-        <w:rPr/>
+        <w:rPr>
+          <w:color w:val="000000"/>
+        </w:rPr>
+      </w:pPr>
+      <w:r>
+        <w:rPr>
+          <w:color w:val="000000"/>
+        </w:rPr>
         <w:t>Installationsprogrammet tilbyder at starte IBOS Nodelæser som afslutning på installations-processen. Alternativt kan man bagefter starte IBOS Nodelæser som ethvert andet Windows program</w:t>
       </w:r>
       <w:r>
         <w:rPr>
+          <w:color w:val="000000"/>
           <w:lang w:val="da-DK"/>
         </w:rPr>
         <w:t xml:space="preserve"> ligesom man kan </w:t>
       </w:r>
       <w:r>
-        <w:rPr/>
+        <w:rPr>
+          <w:color w:val="000000"/>
+        </w:rPr>
         <w:t>definere en tastaturgenvej.</w:t>
       </w:r>
     </w:p>
     <w:p>
       <w:pPr>
         <w:pStyle w:val="Brdtekst"/>
-        <w:rPr/>
-      </w:pPr>
-      <w:r>
-        <w:rPr/>
+        <w:rPr>
+          <w:color w:val="000000"/>
+        </w:rPr>
+      </w:pPr>
+      <w:r>
+        <w:rPr>
+          <w:color w:val="000000"/>
+        </w:rPr>
       </w:r>
     </w:p>
     <w:p>
       <w:pPr>
         <w:pStyle w:val="Brdtekst"/>
-        <w:rPr/>
-      </w:pPr>
-      <w:r>
-        <w:rPr/>
+        <w:rPr>
+          <w:color w:val="000000"/>
+        </w:rPr>
+      </w:pPr>
+      <w:r>
+        <w:rPr>
+          <w:color w:val="000000"/>
+        </w:rPr>
         <w:t>Når "IBOS Nodelæser" er installeret skal man straks gå videre med opsætning af JAWS. Dette er nødvendigt for at man fra begyndelsen får den rigtige oplevelse af samspillet mellem "IBOS nodelæser" og JAWS !</w:t>
       </w:r>
     </w:p>
@@ -895,51 +1071,70 @@
           <w:ilvl w:val="0"/>
           <w:numId w:val="2"/>
         </w:numPr>
-        <w:rPr/>
+        <w:rPr>
+          <w:color w:val="000000"/>
+        </w:rPr>
       </w:pPr>
       <w:bookmarkStart w:id="3" w:name="__RefHeading___Toc531010035"/>
       <w:bookmarkEnd w:id="3"/>
       <w:r>
-        <w:rPr/>
+        <w:rPr>
+          <w:color w:val="000000"/>
+        </w:rPr>
         <w:t>Opsætning af JAWS for "IBOS Nodelæser"</w:t>
       </w:r>
     </w:p>
     <w:p>
       <w:pPr>
         <w:pStyle w:val="Brdtekst"/>
-        <w:rPr/>
-      </w:pPr>
-      <w:r>
-        <w:rPr/>
+        <w:rPr>
+          <w:color w:val="000000"/>
+        </w:rPr>
+      </w:pPr>
+      <w:r>
+        <w:rPr>
+          <w:color w:val="000000"/>
+        </w:rPr>
       </w:r>
     </w:p>
     <w:p>
       <w:pPr>
         <w:pStyle w:val="Brdtekst"/>
-        <w:rPr/>
-      </w:pPr>
-      <w:r>
-        <w:rPr/>
+        <w:rPr>
+          <w:color w:val="000000"/>
+        </w:rPr>
+      </w:pPr>
+      <w:r>
+        <w:rPr>
+          <w:color w:val="000000"/>
+        </w:rPr>
         <w:t xml:space="preserve">Hvis man ønsker at anvende IBOS Nodelæser sammen med et punktdisplay </w:t>
       </w:r>
       <w:r>
         <w:rPr>
+          <w:color w:val="000000"/>
           <w:lang w:val="da-DK"/>
         </w:rPr>
         <w:t>bør</w:t>
       </w:r>
       <w:r>
-        <w:rPr/>
+        <w:rPr>
+          <w:color w:val="000000"/>
+        </w:rPr>
         <w:t xml:space="preserve"> man straks efter installationen af IBOS Nodelæser ændre nogle få JAWS indstillinger. Disse ændringer laves KUN for IBOS Nodelæser og har altså ingen indflydelse for JAWS opførsel over for andre programmer.</w:t>
       </w:r>
     </w:p>
     <w:p>
       <w:pPr>
         <w:pStyle w:val="Brdtekst"/>
-        <w:rPr/>
-      </w:pPr>
-      <w:r>
-        <w:rPr/>
+        <w:rPr>
+          <w:color w:val="000000"/>
+        </w:rPr>
+      </w:pPr>
+      <w:r>
+        <w:rPr>
+          <w:color w:val="000000"/>
+        </w:rPr>
         <w:t xml:space="preserve">Selvom man ikke fra begyndelsen ønsker at bruge IBOS nodelæser sammen med et punktdisplay anbefales det, at man alligevel gennemfører nedenstående, så man ikke får problemer senere! </w:t>
       </w:r>
     </w:p>
@@ -950,10 +1145,14 @@
           <w:ilvl w:val="0"/>
           <w:numId w:val="5"/>
         </w:numPr>
-        <w:rPr/>
-      </w:pPr>
-      <w:r>
-        <w:rPr/>
+        <w:rPr>
+          <w:color w:val="000000"/>
+        </w:rPr>
+      </w:pPr>
+      <w:r>
+        <w:rPr>
+          <w:color w:val="000000"/>
+        </w:rPr>
         <w:t>Start JAWS</w:t>
       </w:r>
     </w:p>
@@ -964,10 +1163,14 @@
           <w:ilvl w:val="0"/>
           <w:numId w:val="5"/>
         </w:numPr>
-        <w:rPr/>
-      </w:pPr>
-      <w:r>
-        <w:rPr/>
+        <w:rPr>
+          <w:color w:val="000000"/>
+        </w:rPr>
+      </w:pPr>
+      <w:r>
+        <w:rPr>
+          <w:color w:val="000000"/>
+        </w:rPr>
         <w:t>Start IBOS Nodelæser og giv programmet focus</w:t>
       </w:r>
     </w:p>
@@ -978,10 +1181,14 @@
           <w:ilvl w:val="0"/>
           <w:numId w:val="5"/>
         </w:numPr>
-        <w:rPr/>
-      </w:pPr>
-      <w:r>
-        <w:rPr/>
+        <w:rPr>
+          <w:color w:val="000000"/>
+        </w:rPr>
+      </w:pPr>
+      <w:r>
+        <w:rPr>
+          <w:color w:val="000000"/>
+        </w:rPr>
         <w:t>Tast INSERT + F2 for at starte "JAWS Manager"</w:t>
       </w:r>
     </w:p>
@@ -992,10 +1199,14 @@
           <w:ilvl w:val="0"/>
           <w:numId w:val="5"/>
         </w:numPr>
-        <w:rPr/>
-      </w:pPr>
-      <w:r>
-        <w:rPr/>
+        <w:rPr>
+          <w:color w:val="000000"/>
+        </w:rPr>
+      </w:pPr>
+      <w:r>
+        <w:rPr>
+          <w:color w:val="000000"/>
+        </w:rPr>
         <w:t>Vælg IndstillingsCenter og tryk for at vise dialogen "Tilføj ny konfiguration"</w:t>
       </w:r>
     </w:p>
@@ -1006,20 +1217,28 @@
           <w:ilvl w:val="0"/>
           <w:numId w:val="5"/>
         </w:numPr>
-        <w:rPr/>
-      </w:pPr>
-      <w:r>
-        <w:rPr/>
+        <w:rPr>
+          <w:color w:val="000000"/>
+        </w:rPr>
+      </w:pPr>
+      <w:r>
+        <w:rPr>
+          <w:color w:val="000000"/>
+        </w:rPr>
         <w:t>Vælg OK som  starter "JAWS Indstillingscenter–IBOS MusicXmlReader"</w:t>
       </w:r>
     </w:p>
     <w:p>
       <w:pPr>
         <w:pStyle w:val="Normal"/>
-        <w:rPr/>
-      </w:pPr>
-      <w:r>
-        <w:rPr/>
+        <w:rPr>
+          <w:color w:val="000000"/>
+        </w:rPr>
+      </w:pPr>
+      <w:r>
+        <w:rPr>
+          <w:color w:val="000000"/>
+        </w:rPr>
       </w:r>
       <w:r>
         <w:br w:type="page"/>
@@ -1028,29 +1247,41 @@
     <w:p>
       <w:pPr>
         <w:pStyle w:val="Normal"/>
-        <w:rPr/>
-      </w:pPr>
-      <w:r>
-        <w:rPr/>
-      </w:r>
-    </w:p>
-    <w:p>
-      <w:pPr>
-        <w:pStyle w:val="Normal"/>
-        <w:rPr/>
-      </w:pPr>
-      <w:r>
-        <w:rPr/>
+        <w:rPr>
+          <w:color w:val="000000"/>
+        </w:rPr>
+      </w:pPr>
+      <w:r>
+        <w:rPr>
+          <w:color w:val="000000"/>
+        </w:rPr>
+      </w:r>
+    </w:p>
+    <w:p>
+      <w:pPr>
+        <w:pStyle w:val="Normal"/>
+        <w:rPr>
+          <w:color w:val="000000"/>
+        </w:rPr>
+      </w:pPr>
+      <w:r>
+        <w:rPr>
+          <w:color w:val="000000"/>
+        </w:rPr>
         <w:t>Lav derefter følgende ændringer i JAWS indstillinger for "IBOS MusicXmlReader"</w:t>
       </w:r>
     </w:p>
     <w:p>
       <w:pPr>
         <w:pStyle w:val="Normal"/>
-        <w:rPr/>
-      </w:pPr>
-      <w:r>
-        <w:rPr/>
+        <w:rPr>
+          <w:color w:val="000000"/>
+        </w:rPr>
+      </w:pPr>
+      <w:r>
+        <w:rPr>
+          <w:color w:val="000000"/>
+        </w:rPr>
       </w:r>
     </w:p>
     <w:tbl>
@@ -1067,8 +1298,8 @@
       </w:tblPr>
       <w:tblGrid>
         <w:gridCol w:w="3689"/>
-        <w:gridCol w:w="1919"/>
-        <w:gridCol w:w="4039"/>
+        <w:gridCol w:w="1918"/>
+        <w:gridCol w:w="4040"/>
       </w:tblGrid>
       <w:tr>
         <w:trPr/>
@@ -1085,12 +1316,15 @@
           <w:p>
             <w:pPr>
               <w:pStyle w:val="Tabelindhold"/>
-              <w:rPr/>
+              <w:rPr>
+                <w:color w:val="000000"/>
+              </w:rPr>
             </w:pPr>
             <w:r>
               <w:rPr>
                 <w:b/>
                 <w:bCs/>
+                <w:color w:val="000000"/>
               </w:rPr>
               <w:t>Indstillings navn</w:t>
             </w:r>
@@ -1098,7 +1332,7 @@
         </w:tc>
         <w:tc>
           <w:tcPr>
-            <w:tcW w:w="1919" w:type="dxa"/>
+            <w:tcW w:w="1918" w:type="dxa"/>
             <w:tcBorders>
               <w:top w:val="single" w:sz="2" w:space="0" w:color="000000"/>
               <w:left w:val="single" w:sz="2" w:space="0" w:color="000000"/>
@@ -1119,6 +1353,7 @@
               <w:rPr>
                 <w:b/>
                 <w:bCs/>
+                <w:color w:val="000000"/>
               </w:rPr>
               <w:t>Handling</w:t>
             </w:r>
@@ -1126,7 +1361,7 @@
         </w:tc>
         <w:tc>
           <w:tcPr>
-            <w:tcW w:w="4039" w:type="dxa"/>
+            <w:tcW w:w="4040" w:type="dxa"/>
             <w:tcBorders>
               <w:top w:val="single" w:sz="2" w:space="0" w:color="000000"/>
               <w:left w:val="single" w:sz="2" w:space="0" w:color="000000"/>
@@ -1148,6 +1383,7 @@
               <w:rPr>
                 <w:b/>
                 <w:bCs/>
+                <w:color w:val="000000"/>
               </w:rPr>
               <w:t>Virkning</w:t>
             </w:r>
@@ -1168,27 +1404,35 @@
           <w:p>
             <w:pPr>
               <w:pStyle w:val="Normal"/>
-              <w:rPr/>
-            </w:pPr>
-            <w:r>
-              <w:rPr/>
+              <w:rPr>
+                <w:color w:val="000000"/>
+              </w:rPr>
+            </w:pPr>
+            <w:r>
+              <w:rPr>
+                <w:color w:val="000000"/>
+              </w:rPr>
               <w:t>Braille-&gt;Avanceret-&gt;</w:t>
             </w:r>
           </w:p>
           <w:p>
             <w:pPr>
               <w:pStyle w:val="Normal"/>
-              <w:rPr/>
-            </w:pPr>
-            <w:r>
-              <w:rPr/>
+              <w:rPr>
+                <w:color w:val="000000"/>
+              </w:rPr>
+            </w:pPr>
+            <w:r>
+              <w:rPr>
+                <w:color w:val="000000"/>
+              </w:rPr>
               <w:t xml:space="preserve">"Placering af statusceller" </w:t>
             </w:r>
           </w:p>
         </w:tc>
         <w:tc>
           <w:tcPr>
-            <w:tcW w:w="1919" w:type="dxa"/>
+            <w:tcW w:w="1918" w:type="dxa"/>
             <w:tcBorders>
               <w:left w:val="single" w:sz="2" w:space="0" w:color="000000"/>
               <w:bottom w:val="single" w:sz="2" w:space="0" w:color="000000"/>
@@ -1198,17 +1442,21 @@
           <w:p>
             <w:pPr>
               <w:pStyle w:val="Normal"/>
-              <w:rPr/>
-            </w:pPr>
-            <w:r>
-              <w:rPr/>
+              <w:rPr>
+                <w:color w:val="000000"/>
+              </w:rPr>
+            </w:pPr>
+            <w:r>
+              <w:rPr>
+                <w:color w:val="000000"/>
+              </w:rPr>
               <w:t>Vælg "Ingen"</w:t>
             </w:r>
           </w:p>
         </w:tc>
         <w:tc>
           <w:tcPr>
-            <w:tcW w:w="4039" w:type="dxa"/>
+            <w:tcW w:w="4040" w:type="dxa"/>
             <w:tcBorders>
               <w:left w:val="single" w:sz="2" w:space="0" w:color="000000"/>
               <w:bottom w:val="single" w:sz="2" w:space="0" w:color="000000"/>
@@ -1219,10 +1467,14 @@
           <w:p>
             <w:pPr>
               <w:pStyle w:val="Normal"/>
-              <w:rPr/>
-            </w:pPr>
-            <w:r>
-              <w:rPr/>
+              <w:rPr>
+                <w:color w:val="000000"/>
+              </w:rPr>
+            </w:pPr>
+            <w:r>
+              <w:rPr>
+                <w:color w:val="000000"/>
+              </w:rPr>
               <w:t>Fjerner overflødig information om Windows kontrol type</w:t>
             </w:r>
           </w:p>
@@ -1242,27 +1494,35 @@
           <w:p>
             <w:pPr>
               <w:pStyle w:val="Normal"/>
-              <w:rPr/>
-            </w:pPr>
-            <w:r>
-              <w:rPr/>
+              <w:rPr>
+                <w:color w:val="000000"/>
+              </w:rPr>
+            </w:pPr>
+            <w:r>
+              <w:rPr>
+                <w:color w:val="000000"/>
+              </w:rPr>
               <w:t>Braille-&gt;Generelt-&gt;</w:t>
             </w:r>
           </w:p>
           <w:p>
             <w:pPr>
               <w:pStyle w:val="Normal"/>
-              <w:rPr/>
-            </w:pPr>
-            <w:r>
-              <w:rPr/>
+              <w:rPr>
+                <w:color w:val="000000"/>
+              </w:rPr>
+            </w:pPr>
+            <w:r>
+              <w:rPr>
+                <w:color w:val="000000"/>
+              </w:rPr>
               <w:t>"Brailletilstand"</w:t>
             </w:r>
           </w:p>
         </w:tc>
         <w:tc>
           <w:tcPr>
-            <w:tcW w:w="1919" w:type="dxa"/>
+            <w:tcW w:w="1918" w:type="dxa"/>
             <w:tcBorders>
               <w:left w:val="single" w:sz="2" w:space="0" w:color="000000"/>
               <w:bottom w:val="single" w:sz="2" w:space="0" w:color="000000"/>
@@ -1272,27 +1532,35 @@
           <w:p>
             <w:pPr>
               <w:pStyle w:val="Tabelindhold"/>
-              <w:rPr/>
-            </w:pPr>
-            <w:r>
-              <w:rPr/>
+              <w:rPr>
+                <w:color w:val="000000"/>
+              </w:rPr>
+            </w:pPr>
+            <w:r>
+              <w:rPr>
+                <w:color w:val="000000"/>
+              </w:rPr>
               <w:t xml:space="preserve">Vælg </w:t>
             </w:r>
           </w:p>
           <w:p>
             <w:pPr>
               <w:pStyle w:val="Tabelindhold"/>
-              <w:rPr/>
-            </w:pPr>
-            <w:r>
-              <w:rPr/>
+              <w:rPr>
+                <w:color w:val="000000"/>
+              </w:rPr>
+            </w:pPr>
+            <w:r>
+              <w:rPr>
+                <w:color w:val="000000"/>
+              </w:rPr>
               <w:t>"Output for tale"</w:t>
             </w:r>
           </w:p>
         </w:tc>
         <w:tc>
           <w:tcPr>
-            <w:tcW w:w="4039" w:type="dxa"/>
+            <w:tcW w:w="4040" w:type="dxa"/>
             <w:tcBorders>
               <w:left w:val="single" w:sz="2" w:space="0" w:color="000000"/>
               <w:bottom w:val="single" w:sz="2" w:space="0" w:color="000000"/>
@@ -1303,10 +1571,14 @@
           <w:p>
             <w:pPr>
               <w:pStyle w:val="Tabelindhold"/>
-              <w:rPr/>
-            </w:pPr>
-            <w:r>
-              <w:rPr/>
+              <w:rPr>
+                <w:color w:val="000000"/>
+              </w:rPr>
+            </w:pPr>
+            <w:r>
+              <w:rPr>
+                <w:color w:val="000000"/>
+              </w:rPr>
               <w:t>Sender samme information til Braille displayet som til talesyntesen.</w:t>
             </w:r>
           </w:p>
@@ -1326,27 +1598,35 @@
           <w:p>
             <w:pPr>
               <w:pStyle w:val="Normal"/>
-              <w:rPr/>
-            </w:pPr>
-            <w:r>
-              <w:rPr/>
+              <w:rPr>
+                <w:color w:val="000000"/>
+              </w:rPr>
+            </w:pPr>
+            <w:r>
+              <w:rPr>
+                <w:color w:val="000000"/>
+              </w:rPr>
               <w:t>Braille-&gt;Generelt-&gt;</w:t>
             </w:r>
           </w:p>
           <w:p>
             <w:pPr>
               <w:pStyle w:val="Normal"/>
-              <w:rPr/>
-            </w:pPr>
-            <w:r>
-              <w:rPr/>
+              <w:rPr>
+                <w:color w:val="000000"/>
+              </w:rPr>
+            </w:pPr>
+            <w:r>
+              <w:rPr>
+                <w:color w:val="000000"/>
+              </w:rPr>
               <w:t>"Vis Tekst i 8 punkt Braille tilstand"</w:t>
             </w:r>
           </w:p>
         </w:tc>
         <w:tc>
           <w:tcPr>
-            <w:tcW w:w="1919" w:type="dxa"/>
+            <w:tcW w:w="1918" w:type="dxa"/>
             <w:tcBorders>
               <w:left w:val="single" w:sz="2" w:space="0" w:color="000000"/>
               <w:bottom w:val="single" w:sz="2" w:space="0" w:color="000000"/>
@@ -1356,17 +1636,21 @@
           <w:p>
             <w:pPr>
               <w:pStyle w:val="Tabelindhold"/>
-              <w:rPr/>
-            </w:pPr>
-            <w:r>
-              <w:rPr/>
+              <w:rPr>
+                <w:color w:val="000000"/>
+              </w:rPr>
+            </w:pPr>
+            <w:r>
+              <w:rPr>
+                <w:color w:val="000000"/>
+              </w:rPr>
               <w:t>Markér  checkbox</w:t>
             </w:r>
           </w:p>
         </w:tc>
         <w:tc>
           <w:tcPr>
-            <w:tcW w:w="4039" w:type="dxa"/>
+            <w:tcW w:w="4040" w:type="dxa"/>
             <w:tcBorders>
               <w:left w:val="single" w:sz="2" w:space="0" w:color="000000"/>
               <w:bottom w:val="single" w:sz="2" w:space="0" w:color="000000"/>
@@ -1377,10 +1661,14 @@
           <w:p>
             <w:pPr>
               <w:pStyle w:val="Tabelindhold"/>
-              <w:rPr/>
-            </w:pPr>
-            <w:r>
-              <w:rPr/>
+              <w:rPr>
+                <w:color w:val="000000"/>
+              </w:rPr>
+            </w:pPr>
+            <w:r>
+              <w:rPr>
+                <w:color w:val="000000"/>
+              </w:rPr>
               <w:t>Viser punkt-output i 8-punkt.</w:t>
             </w:r>
           </w:p>
@@ -1400,27 +1688,35 @@
           <w:p>
             <w:pPr>
               <w:pStyle w:val="Normal"/>
-              <w:rPr/>
-            </w:pPr>
-            <w:r>
-              <w:rPr/>
+              <w:rPr>
+                <w:color w:val="000000"/>
+              </w:rPr>
+            </w:pPr>
+            <w:r>
+              <w:rPr>
+                <w:color w:val="000000"/>
+              </w:rPr>
               <w:t>Braille-&gt;Generelt-&gt;Panorering-&gt;</w:t>
             </w:r>
           </w:p>
           <w:p>
             <w:pPr>
               <w:pStyle w:val="Normal"/>
-              <w:rPr/>
-            </w:pPr>
-            <w:r>
-              <w:rPr/>
+              <w:rPr>
+                <w:color w:val="000000"/>
+              </w:rPr>
+            </w:pPr>
+            <w:r>
+              <w:rPr>
+                <w:color w:val="000000"/>
+              </w:rPr>
               <w:t>"Bruger panoreringstilstand"</w:t>
             </w:r>
           </w:p>
         </w:tc>
         <w:tc>
           <w:tcPr>
-            <w:tcW w:w="1919" w:type="dxa"/>
+            <w:tcW w:w="1918" w:type="dxa"/>
             <w:tcBorders>
               <w:left w:val="single" w:sz="2" w:space="0" w:color="000000"/>
               <w:bottom w:val="single" w:sz="2" w:space="0" w:color="000000"/>
@@ -1430,27 +1726,35 @@
           <w:p>
             <w:pPr>
               <w:pStyle w:val="Normal"/>
-              <w:rPr/>
-            </w:pPr>
-            <w:r>
-              <w:rPr/>
+              <w:rPr>
+                <w:color w:val="000000"/>
+              </w:rPr>
+            </w:pPr>
+            <w:r>
+              <w:rPr>
+                <w:color w:val="000000"/>
+              </w:rPr>
               <w:t xml:space="preserve">Vælg </w:t>
             </w:r>
           </w:p>
           <w:p>
             <w:pPr>
               <w:pStyle w:val="Normal"/>
-              <w:rPr/>
-            </w:pPr>
-            <w:r>
-              <w:rPr/>
+              <w:rPr>
+                <w:color w:val="000000"/>
+              </w:rPr>
+            </w:pPr>
+            <w:r>
+              <w:rPr>
+                <w:color w:val="000000"/>
+              </w:rPr>
               <w:t>"Maksimér tekst"</w:t>
             </w:r>
           </w:p>
         </w:tc>
         <w:tc>
           <w:tcPr>
-            <w:tcW w:w="4039" w:type="dxa"/>
+            <w:tcW w:w="4040" w:type="dxa"/>
             <w:tcBorders>
               <w:left w:val="single" w:sz="2" w:space="0" w:color="000000"/>
               <w:bottom w:val="single" w:sz="2" w:space="0" w:color="000000"/>
@@ -1461,10 +1765,14 @@
           <w:p>
             <w:pPr>
               <w:pStyle w:val="Normal"/>
-              <w:rPr/>
-            </w:pPr>
-            <w:r>
-              <w:rPr/>
+              <w:rPr>
+                <w:color w:val="000000"/>
+              </w:rPr>
+            </w:pPr>
+            <w:r>
+              <w:rPr>
+                <w:color w:val="000000"/>
+              </w:rPr>
               <w:t>Optimerer placeringen af information på punkt-displayet.</w:t>
             </w:r>
           </w:p>
@@ -1474,19 +1782,26 @@
     <w:p>
       <w:pPr>
         <w:pStyle w:val="Normal"/>
-        <w:rPr/>
-      </w:pPr>
-      <w:r>
-        <w:rPr/>
-      </w:r>
-    </w:p>
-    <w:p>
-      <w:pPr>
-        <w:pStyle w:val="Normal"/>
-        <w:rPr/>
-      </w:pPr>
-      <w:r>
-        <w:rPr>
+        <w:rPr>
+          <w:color w:val="000000"/>
+        </w:rPr>
+      </w:pPr>
+      <w:r>
+        <w:rPr>
+          <w:color w:val="000000"/>
+        </w:rPr>
+      </w:r>
+    </w:p>
+    <w:p>
+      <w:pPr>
+        <w:pStyle w:val="Normal"/>
+        <w:rPr>
+          <w:color w:val="000000"/>
+        </w:rPr>
+      </w:pPr>
+      <w:r>
+        <w:rPr>
+          <w:color w:val="000000"/>
           <w:lang w:val="da-DK"/>
         </w:rPr>
         <w:t>Hvis men desuden ønsker at undgå at JAWS ustandselig annoncerer positionsinformation (for eksempel ”Linie 4 af 27”) samt komponenttype, (for eksempel ”listbox”) kan man i JAWS indstillingscenter med fordel anvende følgende indstillinger:</w:t>
@@ -1496,11 +1811,13 @@
       <w:pPr>
         <w:pStyle w:val="Normal"/>
         <w:rPr>
+          <w:color w:val="000000"/>
           <w:lang w:val="da-DK"/>
         </w:rPr>
       </w:pPr>
       <w:r>
         <w:rPr>
+          <w:color w:val="000000"/>
           <w:lang w:val="da-DK"/>
         </w:rPr>
       </w:r>
@@ -1518,15 +1835,15 @@
         </w:tblCellMar>
       </w:tblPr>
       <w:tblGrid>
-        <w:gridCol w:w="3793"/>
+        <w:gridCol w:w="3791"/>
         <w:gridCol w:w="2724"/>
-        <w:gridCol w:w="3271"/>
+        <w:gridCol w:w="3273"/>
       </w:tblGrid>
       <w:tr>
         <w:trPr/>
         <w:tc>
           <w:tcPr>
-            <w:tcW w:w="3793" w:type="dxa"/>
+            <w:tcW w:w="3791" w:type="dxa"/>
             <w:tcBorders>
               <w:top w:val="single" w:sz="4" w:space="0" w:color="000000"/>
               <w:left w:val="single" w:sz="4" w:space="0" w:color="000000"/>
@@ -1543,6 +1860,7 @@
             </w:pPr>
             <w:r>
               <w:rPr>
+                <w:color w:val="000000"/>
                 <w:lang w:val="da-DK"/>
               </w:rPr>
               <w:t>Indstillingens navn</w:t>
@@ -1568,6 +1886,7 @@
             </w:pPr>
             <w:r>
               <w:rPr>
+                <w:color w:val="000000"/>
                 <w:lang w:val="da-DK"/>
               </w:rPr>
               <w:t>Handling</w:t>
@@ -1576,7 +1895,7 @@
         </w:tc>
         <w:tc>
           <w:tcPr>
-            <w:tcW w:w="3271" w:type="dxa"/>
+            <w:tcW w:w="3273" w:type="dxa"/>
             <w:tcBorders>
               <w:top w:val="single" w:sz="4" w:space="0" w:color="000000"/>
               <w:left w:val="single" w:sz="4" w:space="0" w:color="000000"/>
@@ -1594,6 +1913,7 @@
             </w:pPr>
             <w:r>
               <w:rPr>
+                <w:color w:val="000000"/>
                 <w:lang w:val="da-DK"/>
               </w:rPr>
               <w:t>Virkning</w:t>
@@ -1605,7 +1925,7 @@
         <w:trPr/>
         <w:tc>
           <w:tcPr>
-            <w:tcW w:w="3793" w:type="dxa"/>
+            <w:tcW w:w="3791" w:type="dxa"/>
             <w:tcBorders>
               <w:top w:val="single" w:sz="4" w:space="0" w:color="000000"/>
               <w:left w:val="single" w:sz="4" w:space="0" w:color="000000"/>
@@ -1622,6 +1942,7 @@
             </w:pPr>
             <w:r>
               <w:rPr>
+                <w:color w:val="000000"/>
                 <w:lang w:val="da-DK"/>
               </w:rPr>
               <w:t>-&gt; Taleinformation</w:t>
@@ -1636,6 +1957,7 @@
             </w:pPr>
             <w:r>
               <w:rPr>
+                <w:color w:val="000000"/>
                 <w:lang w:val="da-DK"/>
               </w:rPr>
               <w:t>-&gt; Konfigurer informationsniveau</w:t>
@@ -1644,10 +1966,13 @@
           <w:p>
             <w:pPr>
               <w:pStyle w:val="Normal"/>
-              <w:rPr/>
-            </w:pPr>
-            <w:r>
-              <w:rPr>
+              <w:rPr>
+                <w:color w:val="000000"/>
+              </w:rPr>
+            </w:pPr>
+            <w:r>
+              <w:rPr>
+                <w:color w:val="000000"/>
                 <w:lang w:val="da-DK"/>
               </w:rPr>
               <w:t>-&gt; Begynder</w:t>
@@ -1662,6 +1987,7 @@
             </w:pPr>
             <w:r>
               <w:rPr>
+                <w:color w:val="000000"/>
                 <w:lang w:val="da-DK"/>
               </w:rPr>
               <w:t>-&gt; Positionsinformation</w:t>
@@ -1687,6 +2013,7 @@
             </w:pPr>
             <w:r>
               <w:rPr>
+                <w:color w:val="000000"/>
                 <w:lang w:val="da-DK"/>
               </w:rPr>
               <w:t>Fjern markering fra checkbox</w:t>
@@ -1695,7 +2022,7 @@
         </w:tc>
         <w:tc>
           <w:tcPr>
-            <w:tcW w:w="3271" w:type="dxa"/>
+            <w:tcW w:w="3273" w:type="dxa"/>
             <w:tcBorders>
               <w:top w:val="single" w:sz="4" w:space="0" w:color="000000"/>
               <w:left w:val="single" w:sz="4" w:space="0" w:color="000000"/>
@@ -1713,6 +2040,7 @@
             </w:pPr>
             <w:r>
               <w:rPr>
+                <w:color w:val="000000"/>
                 <w:lang w:val="da-DK"/>
               </w:rPr>
               <w:t>Fjerner overflødig information om position i og størrelse af den aktuelle listbox</w:t>
@@ -1724,7 +2052,7 @@
         <w:trPr/>
         <w:tc>
           <w:tcPr>
-            <w:tcW w:w="3793" w:type="dxa"/>
+            <w:tcW w:w="3791" w:type="dxa"/>
             <w:tcBorders>
               <w:top w:val="single" w:sz="4" w:space="0" w:color="000000"/>
               <w:left w:val="single" w:sz="4" w:space="0" w:color="000000"/>
@@ -1741,6 +2069,7 @@
             </w:pPr>
             <w:r>
               <w:rPr>
+                <w:color w:val="000000"/>
                 <w:lang w:val="da-DK"/>
               </w:rPr>
               <w:t>-&gt; Taleinformation</w:t>
@@ -1755,6 +2084,7 @@
             </w:pPr>
             <w:r>
               <w:rPr>
+                <w:color w:val="000000"/>
                 <w:lang w:val="da-DK"/>
               </w:rPr>
               <w:t>-&gt; Konfigurer informationsniveau</w:t>
@@ -1763,10 +2093,13 @@
           <w:p>
             <w:pPr>
               <w:pStyle w:val="Normal"/>
-              <w:rPr/>
-            </w:pPr>
-            <w:r>
-              <w:rPr>
+              <w:rPr>
+                <w:color w:val="000000"/>
+              </w:rPr>
+            </w:pPr>
+            <w:r>
+              <w:rPr>
+                <w:color w:val="000000"/>
                 <w:lang w:val="da-DK"/>
               </w:rPr>
               <w:t>-&gt; Begynder</w:t>
@@ -1781,6 +2114,7 @@
             </w:pPr>
             <w:r>
               <w:rPr>
+                <w:color w:val="000000"/>
                 <w:lang w:val="da-DK"/>
               </w:rPr>
               <w:t>-&gt; Kontroltype</w:t>
@@ -1806,6 +2140,7 @@
             </w:pPr>
             <w:r>
               <w:rPr>
+                <w:color w:val="000000"/>
                 <w:lang w:val="da-DK"/>
               </w:rPr>
               <w:t>Fjern markering fra checkbox</w:t>
@@ -1814,7 +2149,7 @@
         </w:tc>
         <w:tc>
           <w:tcPr>
-            <w:tcW w:w="3271" w:type="dxa"/>
+            <w:tcW w:w="3273" w:type="dxa"/>
             <w:tcBorders>
               <w:top w:val="single" w:sz="4" w:space="0" w:color="000000"/>
               <w:left w:val="single" w:sz="4" w:space="0" w:color="000000"/>
@@ -1832,6 +2167,7 @@
             </w:pPr>
             <w:r>
               <w:rPr>
+                <w:color w:val="000000"/>
                 <w:lang w:val="da-DK"/>
               </w:rPr>
               <w:t>Fjerner overflødig information om type af alle kontroller</w:t>
@@ -1843,26 +2179,35 @@
     <w:p>
       <w:pPr>
         <w:pStyle w:val="Normal"/>
-        <w:rPr/>
-      </w:pPr>
-      <w:r>
-        <w:rPr/>
-      </w:r>
-    </w:p>
-    <w:p>
-      <w:pPr>
-        <w:pStyle w:val="Normal"/>
-        <w:rPr/>
+        <w:rPr>
+          <w:color w:val="000000"/>
+        </w:rPr>
+      </w:pPr>
+      <w:r>
+        <w:rPr>
+          <w:color w:val="000000"/>
+        </w:rPr>
+      </w:r>
+    </w:p>
+    <w:p>
+      <w:pPr>
+        <w:pStyle w:val="Normal"/>
+        <w:rPr>
+          <w:color w:val="000000"/>
+        </w:rPr>
       </w:pPr>
       <w:r>
         <w:rPr>
           <w:b/>
           <w:bCs/>
+          <w:color w:val="000000"/>
         </w:rPr>
         <w:t>NOTE:</w:t>
       </w:r>
       <w:r>
-        <w:rPr/>
+        <w:rPr>
+          <w:color w:val="000000"/>
+        </w:rPr>
         <w:t xml:space="preserve"> JAWS gemmer ovenstående konfigurationen i en simpel tekstfil.</w:t>
       </w:r>
     </w:p>
@@ -1875,27 +2220,35 @@
         </w:rPr>
       </w:pPr>
       <w:r>
-        <w:rPr/>
+        <w:rPr>
+          <w:color w:val="000000"/>
+        </w:rPr>
         <w:t xml:space="preserve">Et eksempel på en typisk placering på en dansk PC med brugeren "Jens" og  JAWS </w:t>
       </w:r>
       <w:r>
         <w:rPr>
+          <w:color w:val="000000"/>
           <w:lang w:val="da-DK"/>
         </w:rPr>
         <w:t>2018</w:t>
       </w:r>
       <w:r>
-        <w:rPr/>
+        <w:rPr>
+          <w:color w:val="000000"/>
+        </w:rPr>
         <w:t xml:space="preserve"> er:</w:t>
       </w:r>
     </w:p>
     <w:p>
       <w:pPr>
         <w:pStyle w:val="Normal"/>
-        <w:rPr/>
-      </w:pPr>
-      <w:r>
-        <w:rPr>
+        <w:rPr>
+          <w:color w:val="000000"/>
+        </w:rPr>
+      </w:pPr>
+      <w:r>
+        <w:rPr>
+          <w:color w:val="000000"/>
           <w:sz w:val="22"/>
           <w:szCs w:val="22"/>
         </w:rPr>
@@ -1903,6 +2256,7 @@
       </w:r>
       <w:r>
         <w:rPr>
+          <w:color w:val="000000"/>
           <w:sz w:val="22"/>
           <w:szCs w:val="22"/>
           <w:lang w:val="en-US"/>
@@ -1911,6 +2265,7 @@
       </w:r>
       <w:r>
         <w:rPr>
+          <w:color w:val="000000"/>
           <w:sz w:val="22"/>
           <w:szCs w:val="22"/>
         </w:rPr>
@@ -1920,40 +2275,55 @@
     <w:p>
       <w:pPr>
         <w:pStyle w:val="Normal"/>
-        <w:rPr/>
-      </w:pPr>
-      <w:r>
-        <w:rPr/>
-      </w:r>
-    </w:p>
-    <w:p>
-      <w:pPr>
-        <w:pStyle w:val="Normal"/>
-        <w:rPr/>
-      </w:pPr>
-      <w:r>
-        <w:rPr/>
+        <w:rPr>
+          <w:color w:val="000000"/>
+        </w:rPr>
+      </w:pPr>
+      <w:r>
+        <w:rPr>
+          <w:color w:val="000000"/>
+        </w:rPr>
+      </w:r>
+    </w:p>
+    <w:p>
+      <w:pPr>
+        <w:pStyle w:val="Normal"/>
+        <w:rPr>
+          <w:color w:val="000000"/>
+        </w:rPr>
+      </w:pPr>
+      <w:r>
+        <w:rPr>
+          <w:color w:val="000000"/>
+        </w:rPr>
         <w:t xml:space="preserve">Et typisk </w:t>
       </w:r>
       <w:r>
         <w:rPr>
           <w:b/>
           <w:bCs/>
+          <w:color w:val="000000"/>
         </w:rPr>
         <w:t>eksempel</w:t>
       </w:r>
       <w:r>
-        <w:rPr/>
+        <w:rPr>
+          <w:color w:val="000000"/>
+        </w:rPr>
         <w:t xml:space="preserve"> på indholdet af denne fil efter ovenstående opsætning er:</w:t>
       </w:r>
     </w:p>
     <w:p>
       <w:pPr>
         <w:pStyle w:val="Normal"/>
-        <w:rPr/>
-      </w:pPr>
-      <w:r>
-        <w:rPr/>
+        <w:rPr>
+          <w:color w:val="000000"/>
+        </w:rPr>
+      </w:pPr>
+      <w:r>
+        <w:rPr>
+          <w:color w:val="000000"/>
+        </w:rPr>
       </w:r>
     </w:p>
     <w:tbl>
@@ -1987,140 +2357,196 @@
           <w:p>
             <w:pPr>
               <w:pStyle w:val="Tabelindhold"/>
-              <w:rPr/>
-            </w:pPr>
-            <w:r>
-              <w:rPr/>
+              <w:rPr>
+                <w:color w:val="000000"/>
+              </w:rPr>
+            </w:pPr>
+            <w:r>
+              <w:rPr>
+                <w:color w:val="000000"/>
+              </w:rPr>
               <w:t>[Brailliant BI]</w:t>
             </w:r>
           </w:p>
           <w:p>
             <w:pPr>
               <w:pStyle w:val="Tabelindhold"/>
-              <w:rPr/>
-            </w:pPr>
-            <w:r>
-              <w:rPr/>
+              <w:rPr>
+                <w:color w:val="000000"/>
+              </w:rPr>
+            </w:pPr>
+            <w:r>
+              <w:rPr>
+                <w:color w:val="000000"/>
+              </w:rPr>
               <w:t>PositionOfStatusCells=2</w:t>
             </w:r>
           </w:p>
           <w:p>
             <w:pPr>
               <w:pStyle w:val="Tabelindhold"/>
-              <w:rPr/>
-            </w:pPr>
-            <w:r>
-              <w:rPr/>
+              <w:rPr>
+                <w:color w:val="000000"/>
+              </w:rPr>
+            </w:pPr>
+            <w:r>
+              <w:rPr>
+                <w:color w:val="000000"/>
+              </w:rPr>
               <w:t>UseHowManyStatusCells=0</w:t>
             </w:r>
           </w:p>
           <w:p>
             <w:pPr>
               <w:pStyle w:val="Tabelindhold"/>
-              <w:rPr/>
-            </w:pPr>
-            <w:r>
-              <w:rPr/>
+              <w:rPr>
+                <w:color w:val="000000"/>
+              </w:rPr>
+            </w:pPr>
+            <w:r>
+              <w:rPr>
+                <w:color w:val="000000"/>
+              </w:rPr>
               <w:t>BraillePanMode=2</w:t>
             </w:r>
           </w:p>
           <w:p>
             <w:pPr>
               <w:pStyle w:val="Tabelindhold"/>
-              <w:rPr/>
-            </w:pPr>
-            <w:r>
-              <w:rPr/>
+              <w:rPr>
+                <w:color w:val="000000"/>
+              </w:rPr>
+            </w:pPr>
+            <w:r>
+              <w:rPr>
+                <w:color w:val="000000"/>
+              </w:rPr>
               <w:t>[Braille]</w:t>
             </w:r>
           </w:p>
           <w:p>
             <w:pPr>
               <w:pStyle w:val="Tabelindhold"/>
-              <w:rPr/>
-            </w:pPr>
-            <w:r>
-              <w:rPr/>
+              <w:rPr>
+                <w:color w:val="000000"/>
+              </w:rPr>
+            </w:pPr>
+            <w:r>
+              <w:rPr>
+                <w:color w:val="000000"/>
+              </w:rPr>
               <w:t>BrailleMode=2</w:t>
             </w:r>
           </w:p>
           <w:p>
             <w:pPr>
               <w:pStyle w:val="Tabelindhold"/>
-              <w:rPr/>
-            </w:pPr>
-            <w:r>
-              <w:rPr/>
+              <w:rPr>
+                <w:color w:val="000000"/>
+              </w:rPr>
+            </w:pPr>
+            <w:r>
+              <w:rPr>
+                <w:color w:val="000000"/>
+              </w:rPr>
               <w:t>[Focus40]</w:t>
             </w:r>
           </w:p>
           <w:p>
             <w:pPr>
               <w:pStyle w:val="Tabelindhold"/>
-              <w:rPr/>
-            </w:pPr>
-            <w:r>
-              <w:rPr/>
+              <w:rPr>
+                <w:color w:val="000000"/>
+              </w:rPr>
+            </w:pPr>
+            <w:r>
+              <w:rPr>
+                <w:color w:val="000000"/>
+              </w:rPr>
               <w:t>PositionOfStatusCells=2</w:t>
             </w:r>
           </w:p>
           <w:p>
             <w:pPr>
               <w:pStyle w:val="Tabelindhold"/>
-              <w:rPr/>
-            </w:pPr>
-            <w:r>
-              <w:rPr/>
+              <w:rPr>
+                <w:color w:val="000000"/>
+              </w:rPr>
+            </w:pPr>
+            <w:r>
+              <w:rPr>
+                <w:color w:val="000000"/>
+              </w:rPr>
               <w:t>UseHowManyStatusCells=0</w:t>
             </w:r>
           </w:p>
           <w:p>
             <w:pPr>
               <w:pStyle w:val="Tabelindhold"/>
-              <w:rPr/>
-            </w:pPr>
-            <w:r>
-              <w:rPr/>
+              <w:rPr>
+                <w:color w:val="000000"/>
+              </w:rPr>
+            </w:pPr>
+            <w:r>
+              <w:rPr>
+                <w:color w:val="000000"/>
+              </w:rPr>
               <w:t>BraillePanMode=2</w:t>
             </w:r>
           </w:p>
           <w:p>
             <w:pPr>
               <w:pStyle w:val="Tabelindhold"/>
-              <w:rPr/>
-            </w:pPr>
-            <w:r>
-              <w:rPr/>
+              <w:rPr>
+                <w:color w:val="000000"/>
+              </w:rPr>
+            </w:pPr>
+            <w:r>
+              <w:rPr>
+                <w:color w:val="000000"/>
+              </w:rPr>
               <w:t>[OutputModes]</w:t>
             </w:r>
           </w:p>
           <w:p>
             <w:pPr>
               <w:pStyle w:val="Tabelindhold"/>
-              <w:rPr/>
-            </w:pPr>
-            <w:r>
-              <w:rPr/>
+              <w:rPr>
+                <w:color w:val="000000"/>
+              </w:rPr>
+            </w:pPr>
+            <w:r>
+              <w:rPr>
+                <w:color w:val="000000"/>
+              </w:rPr>
               <w:t>CONTROL_NAME=1|2|2|Kontrolnavn</w:t>
             </w:r>
           </w:p>
           <w:p>
             <w:pPr>
               <w:pStyle w:val="Tabelindhold"/>
-              <w:rPr/>
-            </w:pPr>
-            <w:r>
-              <w:rPr/>
+              <w:rPr>
+                <w:color w:val="000000"/>
+              </w:rPr>
+            </w:pPr>
+            <w:r>
+              <w:rPr>
+                <w:color w:val="000000"/>
+              </w:rPr>
               <w:t>POSITION=0|2|0|Positionsinformation</w:t>
             </w:r>
           </w:p>
           <w:p>
             <w:pPr>
               <w:pStyle w:val="Tabelindhold"/>
-              <w:rPr/>
-            </w:pPr>
-            <w:r>
-              <w:rPr/>
+              <w:rPr>
+                <w:color w:val="000000"/>
+              </w:rPr>
+            </w:pPr>
+            <w:r>
+              <w:rPr>
+                <w:color w:val="000000"/>
+              </w:rPr>
               <w:t>CONTROL_TYPE=0|2|2|Kontroltype</w:t>
             </w:r>
           </w:p>
@@ -2130,48 +2556,68 @@
     <w:p>
       <w:pPr>
         <w:pStyle w:val="Normal"/>
-        <w:rPr/>
-      </w:pPr>
-      <w:r>
-        <w:rPr/>
-      </w:r>
-    </w:p>
-    <w:p>
-      <w:pPr>
-        <w:pStyle w:val="Normal"/>
-        <w:rPr/>
-      </w:pPr>
-      <w:r>
-        <w:rPr/>
+        <w:rPr>
+          <w:color w:val="000000"/>
+        </w:rPr>
+      </w:pPr>
+      <w:r>
+        <w:rPr>
+          <w:color w:val="000000"/>
+        </w:rPr>
+      </w:r>
+    </w:p>
+    <w:p>
+      <w:pPr>
+        <w:pStyle w:val="Normal"/>
+        <w:rPr>
+          <w:color w:val="000000"/>
+        </w:rPr>
+      </w:pPr>
+      <w:r>
+        <w:rPr>
+          <w:color w:val="000000"/>
+        </w:rPr>
         <w:t>Indholdet af den aktuelle JAWS indstillingsfil for IBOS Nodelæser kan inspiceres under</w:t>
       </w:r>
     </w:p>
     <w:p>
       <w:pPr>
         <w:pStyle w:val="Normal"/>
-        <w:rPr/>
-      </w:pPr>
-      <w:r>
-        <w:rPr/>
+        <w:rPr>
+          <w:color w:val="000000"/>
+        </w:rPr>
+      </w:pPr>
+      <w:r>
+        <w:rPr>
+          <w:color w:val="000000"/>
+        </w:rPr>
         <w:t xml:space="preserve">Værktøjer-&gt;Åbn JAWS indstillinger. </w:t>
       </w:r>
     </w:p>
     <w:p>
       <w:pPr>
         <w:pStyle w:val="Normal"/>
-        <w:rPr/>
-      </w:pPr>
-      <w:r>
-        <w:rPr/>
-      </w:r>
-    </w:p>
-    <w:p>
-      <w:pPr>
-        <w:pStyle w:val="Normal"/>
-        <w:rPr/>
-      </w:pPr>
-      <w:r>
-        <w:rPr/>
+        <w:rPr>
+          <w:color w:val="000000"/>
+        </w:rPr>
+      </w:pPr>
+      <w:r>
+        <w:rPr>
+          <w:color w:val="000000"/>
+        </w:rPr>
+      </w:r>
+    </w:p>
+    <w:p>
+      <w:pPr>
+        <w:pStyle w:val="Normal"/>
+        <w:rPr>
+          <w:color w:val="000000"/>
+        </w:rPr>
+      </w:pPr>
+      <w:r>
+        <w:rPr>
+          <w:color w:val="000000"/>
+        </w:rPr>
       </w:r>
     </w:p>
     <w:p>
@@ -2187,6 +2633,7 @@
         <w:rPr>
           <w:b/>
           <w:bCs/>
+          <w:color w:val="000000"/>
         </w:rPr>
         <w:t>Hermed er IBOS nodelæser installeret og klar til brug.</w:t>
       </w:r>
@@ -2194,29 +2641,41 @@
     <w:p>
       <w:pPr>
         <w:pStyle w:val="Normal"/>
-        <w:rPr/>
-      </w:pPr>
-      <w:r>
-        <w:rPr/>
-      </w:r>
-    </w:p>
-    <w:p>
-      <w:pPr>
-        <w:pStyle w:val="Normal"/>
-        <w:rPr/>
-      </w:pPr>
-      <w:r>
-        <w:rPr/>
+        <w:rPr>
+          <w:color w:val="000000"/>
+        </w:rPr>
+      </w:pPr>
+      <w:r>
+        <w:rPr>
+          <w:color w:val="000000"/>
+        </w:rPr>
+      </w:r>
+    </w:p>
+    <w:p>
+      <w:pPr>
+        <w:pStyle w:val="Normal"/>
+        <w:rPr>
+          <w:color w:val="000000"/>
+        </w:rPr>
+      </w:pPr>
+      <w:r>
+        <w:rPr>
+          <w:color w:val="000000"/>
+        </w:rPr>
         <w:t>Installationsfilen indeholder nogle MusicXml filer, som straks er tilgængelige. Disse filer ligger i brugerens private mappe "Dokumenter\IBOS Nodelæser\Eksempler" og indeholder eksempler på blandt andet</w:t>
       </w:r>
     </w:p>
     <w:p>
       <w:pPr>
         <w:pStyle w:val="Normal"/>
-        <w:rPr/>
-      </w:pPr>
-      <w:r>
-        <w:rPr/>
+        <w:rPr>
+          <w:color w:val="000000"/>
+        </w:rPr>
+      </w:pPr>
+      <w:r>
+        <w:rPr>
+          <w:color w:val="000000"/>
+        </w:rPr>
       </w:r>
     </w:p>
     <w:p>
@@ -2226,10 +2685,14 @@
           <w:ilvl w:val="0"/>
           <w:numId w:val="6"/>
         </w:numPr>
-        <w:rPr/>
-      </w:pPr>
-      <w:r>
-        <w:rPr/>
+        <w:rPr>
+          <w:color w:val="000000"/>
+        </w:rPr>
+      </w:pPr>
+      <w:r>
+        <w:rPr>
+          <w:color w:val="000000"/>
+        </w:rPr>
         <w:t>Simple enstemmige melodier</w:t>
       </w:r>
     </w:p>
@@ -2240,10 +2703,14 @@
           <w:ilvl w:val="0"/>
           <w:numId w:val="6"/>
         </w:numPr>
-        <w:rPr/>
-      </w:pPr>
-      <w:r>
-        <w:rPr/>
+        <w:rPr>
+          <w:color w:val="000000"/>
+        </w:rPr>
+      </w:pPr>
+      <w:r>
+        <w:rPr>
+          <w:color w:val="000000"/>
+        </w:rPr>
         <w:t xml:space="preserve">4-stemmige SATB korsatser </w:t>
       </w:r>
     </w:p>
@@ -2254,10 +2721,14 @@
           <w:ilvl w:val="0"/>
           <w:numId w:val="6"/>
         </w:numPr>
-        <w:rPr/>
-      </w:pPr>
-      <w:r>
-        <w:rPr/>
+        <w:rPr>
+          <w:color w:val="000000"/>
+        </w:rPr>
+      </w:pPr>
+      <w:r>
+        <w:rPr>
+          <w:color w:val="000000"/>
+        </w:rPr>
         <w:t>20-stemmige orkester-partiturer</w:t>
       </w:r>
       <w:r>
@@ -2271,60 +2742,84 @@
           <w:ilvl w:val="0"/>
           <w:numId w:val="2"/>
         </w:numPr>
-        <w:rPr/>
+        <w:rPr>
+          <w:color w:val="000000"/>
+        </w:rPr>
       </w:pPr>
       <w:bookmarkStart w:id="4" w:name="__RefHeading___Toc531010036"/>
       <w:bookmarkEnd w:id="4"/>
       <w:r>
-        <w:rPr/>
+        <w:rPr>
+          <w:color w:val="000000"/>
+        </w:rPr>
         <w:t>Installation af andre værktøjer</w:t>
       </w:r>
     </w:p>
     <w:p>
       <w:pPr>
         <w:pStyle w:val="Normal"/>
-        <w:rPr/>
-      </w:pPr>
-      <w:r>
-        <w:rPr/>
-      </w:r>
-    </w:p>
-    <w:p>
-      <w:pPr>
-        <w:pStyle w:val="Normal"/>
-        <w:rPr/>
-      </w:pPr>
-      <w:r>
-        <w:rPr/>
+        <w:rPr>
+          <w:color w:val="000000"/>
+        </w:rPr>
+      </w:pPr>
+      <w:r>
+        <w:rPr>
+          <w:color w:val="000000"/>
+        </w:rPr>
+      </w:r>
+    </w:p>
+    <w:p>
+      <w:pPr>
+        <w:pStyle w:val="Normal"/>
+        <w:rPr>
+          <w:color w:val="000000"/>
+        </w:rPr>
+      </w:pPr>
+      <w:r>
+        <w:rPr>
+          <w:color w:val="000000"/>
+        </w:rPr>
         <w:t>IBOS Nodelæser kan med fordel anvendes sammen med andre værktøjer til håndtering af noder.</w:t>
       </w:r>
     </w:p>
     <w:p>
       <w:pPr>
         <w:pStyle w:val="Normal"/>
-        <w:rPr/>
-      </w:pPr>
-      <w:r>
-        <w:rPr/>
-      </w:r>
-    </w:p>
-    <w:p>
-      <w:pPr>
-        <w:pStyle w:val="Normal"/>
-        <w:rPr/>
-      </w:pPr>
-      <w:r>
-        <w:rPr/>
+        <w:rPr>
+          <w:color w:val="000000"/>
+        </w:rPr>
+      </w:pPr>
+      <w:r>
+        <w:rPr>
+          <w:color w:val="000000"/>
+        </w:rPr>
+      </w:r>
+    </w:p>
+    <w:p>
+      <w:pPr>
+        <w:pStyle w:val="Normal"/>
+        <w:rPr>
+          <w:color w:val="000000"/>
+        </w:rPr>
+      </w:pPr>
+      <w:r>
+        <w:rPr>
+          <w:color w:val="000000"/>
+        </w:rPr>
         <w:t>For eksempel det gratis nodeskrivnings-program MuseScore, som kan downloades fra</w:t>
       </w:r>
     </w:p>
     <w:p>
       <w:pPr>
         <w:pStyle w:val="Normal"/>
-        <w:rPr/>
-      </w:pPr>
-      <w:r>
-        <w:rPr/>
+        <w:rPr>
+          <w:color w:val="000000"/>
+        </w:rPr>
+      </w:pPr>
+      <w:r>
+        <w:rPr>
+          <w:color w:val="000000"/>
+        </w:rPr>
       </w:r>
     </w:p>
     <w:p>
@@ -2336,6 +2831,7 @@
         <w:r>
           <w:rPr>
             <w:rStyle w:val="Hyperlink"/>
+            <w:color w:val="000000"/>
           </w:rPr>
           <w:t>https://musescore.org/da</w:t>
         </w:r>
@@ -2344,45 +2840,54 @@
     <w:p>
       <w:pPr>
         <w:pStyle w:val="Normal"/>
+        <w:rPr>
+          <w:color w:val="000000"/>
+        </w:rPr>
+      </w:pPr>
+      <w:r>
+        <w:rPr>
+          <w:color w:val="000000"/>
+        </w:rPr>
+      </w:r>
+    </w:p>
+    <w:p>
+      <w:pPr>
+        <w:pStyle w:val="Normal"/>
+        <w:rPr>
+          <w:lang w:val="da-DK"/>
+        </w:rPr>
+      </w:pPr>
+      <w:r>
+        <w:rPr>
+          <w:color w:val="000000"/>
+        </w:rPr>
+        <w:t>Tilsvarende kan en 30 dages gratis demo-version af Sibelius downloades fra</w:t>
+      </w:r>
+    </w:p>
+    <w:p>
+      <w:pPr>
+        <w:pStyle w:val="Normal"/>
+        <w:rPr>
+          <w:color w:val="000000"/>
+          <w:lang w:val="da-DK"/>
+        </w:rPr>
+      </w:pPr>
+      <w:r>
+        <w:rPr>
+          <w:color w:val="000000"/>
+          <w:lang w:val="da-DK"/>
+        </w:rPr>
+      </w:r>
+    </w:p>
+    <w:p>
+      <w:pPr>
+        <w:pStyle w:val="Normal"/>
         <w:rPr/>
       </w:pPr>
       <w:r>
-        <w:rPr/>
-      </w:r>
-    </w:p>
-    <w:p>
-      <w:pPr>
-        <w:pStyle w:val="Normal"/>
-        <w:rPr>
-          <w:lang w:val="da-DK"/>
-        </w:rPr>
-      </w:pPr>
-      <w:r>
-        <w:rPr/>
-        <w:t>Tilsvarende kan en 30 dages gratis demo-version af Sibelius downloades fra</w:t>
-      </w:r>
-    </w:p>
-    <w:p>
-      <w:pPr>
-        <w:pStyle w:val="Normal"/>
-        <w:rPr>
-          <w:lang w:val="da-DK"/>
-        </w:rPr>
-      </w:pPr>
-      <w:r>
-        <w:rPr>
-          <w:lang w:val="da-DK"/>
-        </w:rPr>
-      </w:r>
-    </w:p>
-    <w:p>
-      <w:pPr>
-        <w:pStyle w:val="Normal"/>
-        <w:rPr/>
-      </w:pPr>
-      <w:r>
         <w:rPr>
           <w:rFonts w:eastAsia="Times New Roman"/>
+          <w:color w:val="000000"/>
         </w:rPr>
         <w:t xml:space="preserve"> </w:t>
       </w:r>
@@ -2390,6 +2895,7 @@
         <w:r>
           <w:rPr>
             <w:rStyle w:val="Hyperlink"/>
+            <w:color w:val="000000"/>
           </w:rPr>
           <w:t>http://connect.avid.com/Sibelius-Trial.html</w:t>
         </w:r>
@@ -2398,10 +2904,14 @@
     <w:p>
       <w:pPr>
         <w:pStyle w:val="Normal"/>
-        <w:rPr/>
-      </w:pPr>
-      <w:r>
-        <w:rPr/>
+        <w:rPr>
+          <w:color w:val="000000"/>
+        </w:rPr>
+      </w:pPr>
+      <w:r>
+        <w:rPr>
+          <w:color w:val="000000"/>
+        </w:rPr>
       </w:r>
     </w:p>
     <w:p>
@@ -2413,45 +2923,63 @@
       </w:pPr>
       <w:r>
         <w:rPr>
+          <w:color w:val="000000"/>
+        </w:rPr>
+        <w:t>På tilsvarende måde kan men hente testversioner af nodeskrivningsprogrammerne "Capella" og "Finale"</w:t>
+      </w:r>
+    </w:p>
+    <w:p>
+      <w:pPr>
+        <w:pStyle w:val="Normal"/>
+        <w:rPr>
+          <w:color w:val="000000"/>
+        </w:rPr>
+      </w:pPr>
+      <w:r>
+        <w:rPr>
+          <w:color w:val="000000"/>
+        </w:rPr>
+      </w:r>
+    </w:p>
+    <w:p>
+      <w:pPr>
+        <w:pStyle w:val="Normal"/>
+        <w:rPr>
+          <w:color w:val="000000"/>
+        </w:rPr>
+      </w:pPr>
+      <w:r>
+        <w:rPr>
+          <w:color w:val="000000"/>
+        </w:rPr>
+        <w:t>IBOS Nodelæser antager at disse programmer er installeret i deres default placeringer</w:t>
+      </w:r>
+    </w:p>
+    <w:p>
+      <w:pPr>
+        <w:pStyle w:val="Normal"/>
+        <w:rPr>
+          <w:color w:val="000000"/>
+        </w:rPr>
+      </w:pPr>
+      <w:r>
+        <w:rPr>
+          <w:color w:val="000000"/>
+        </w:rPr>
+      </w:r>
+    </w:p>
+    <w:p>
+      <w:pPr>
+        <w:pStyle w:val="Normal"/>
+        <w:rPr>
           <w:color w:val="C9211E"/>
         </w:rPr>
-        <w:t>På tilsvarende måde kan men hente testversioner af nodeskrivningsprogrammerne "Capella" og "Finale"</w:t>
-      </w:r>
-    </w:p>
-    <w:p>
-      <w:pPr>
-        <w:pStyle w:val="Normal"/>
-        <w:rPr/>
-      </w:pPr>
-      <w:r>
-        <w:rPr/>
-      </w:r>
-    </w:p>
-    <w:p>
-      <w:pPr>
-        <w:pStyle w:val="Normal"/>
-        <w:rPr>
-          <w:color w:val="000000"/>
-        </w:rPr>
-      </w:pPr>
-      <w:r>
-        <w:rPr>
-          <w:color w:val="000000"/>
-        </w:rPr>
-        <w:t>IBOS Nodelæser antager at disse programmer er installeret i deres default placeringer</w:t>
-      </w:r>
-    </w:p>
-    <w:p>
-      <w:pPr>
-        <w:pStyle w:val="Normal"/>
-        <w:rPr>
-          <w:color w:val="000000"/>
-        </w:rPr>
-      </w:pPr>
-      <w:r>
-        <w:rPr>
-          <w:color w:val="000000"/>
-        </w:rPr>
+      </w:pPr>
+      <w:r>
+        <w:rPr>
+          <w:color w:val="000000"/>
+        </w:rPr>
+        <w:t>C:\Program Files\MuseScore 3\bin\MuseScore3.exe</w:t>
       </w:r>
     </w:p>
     <w:p>
@@ -2463,9 +2991,23 @@
       </w:pPr>
       <w:r>
         <w:rPr>
+          <w:color w:val="000000"/>
+        </w:rPr>
+        <w:t>C:\Program Files\Avid\Sibelius\Sibelius.exe</w:t>
+      </w:r>
+    </w:p>
+    <w:p>
+      <w:pPr>
+        <w:pStyle w:val="Normal"/>
+        <w:rPr>
           <w:color w:val="C9211E"/>
         </w:rPr>
-        <w:t>C:\Program Files\MuseScore 3\bin\MuseScore3.exe</w:t>
+      </w:pPr>
+      <w:r>
+        <w:rPr>
+          <w:color w:val="000000"/>
+        </w:rPr>
+        <w:t>C:\Program Files (x86)\capella-software\capella 8\bin\capella.exe</w:t>
       </w:r>
     </w:p>
     <w:p>
@@ -2477,35 +3019,7 @@
       </w:pPr>
       <w:r>
         <w:rPr>
-          <w:color w:val="C9211E"/>
-        </w:rPr>
-        <w:t>C:\Program Files\Avid\Sibelius\Sibelius.exe</w:t>
-      </w:r>
-    </w:p>
-    <w:p>
-      <w:pPr>
-        <w:pStyle w:val="Normal"/>
-        <w:rPr>
-          <w:color w:val="C9211E"/>
-        </w:rPr>
-      </w:pPr>
-      <w:r>
-        <w:rPr>
-          <w:color w:val="C9211E"/>
-        </w:rPr>
-        <w:t>C:\Program Files (x86)\capella-software\capella 8\bin\capella.exe</w:t>
-      </w:r>
-    </w:p>
-    <w:p>
-      <w:pPr>
-        <w:pStyle w:val="Normal"/>
-        <w:rPr>
-          <w:color w:val="C9211E"/>
-        </w:rPr>
-      </w:pPr>
-      <w:r>
-        <w:rPr>
-          <w:color w:val="C9211E"/>
+          <w:color w:val="000000"/>
         </w:rPr>
         <w:t>C:\Program Files (x86)\Finale NotePad 2012\Finale NotePad.exe</w:t>
       </w:r>
@@ -2514,12 +3028,13 @@
       <w:pPr>
         <w:pStyle w:val="Normal"/>
         <w:rPr>
+          <w:color w:val="000000"/>
           <w:highlight w:val="white"/>
         </w:rPr>
       </w:pPr>
       <w:r>
         <w:rPr>
-          <w:color w:val="C9211E"/>
+          <w:color w:val="000000"/>
           <w:highlight w:val="white"/>
         </w:rPr>
       </w:r>
@@ -2527,42 +3042,16 @@
     <w:p>
       <w:pPr>
         <w:pStyle w:val="Normal"/>
-        <w:rPr/>
-      </w:pPr>
-      <w:r>
-        <w:rPr>
-          <w:color w:val="C9211E"/>
+        <w:rPr>
+          <w:color w:val="000000"/>
+        </w:rPr>
+      </w:pPr>
+      <w:r>
+        <w:rPr>
+          <w:color w:val="000000"/>
           <w:shd w:fill="FFFFFF" w:val="clear"/>
         </w:rPr>
-        <w:t xml:space="preserve">Hvis disse programmer ikke er installeret i deres default </w:t>
-      </w:r>
-      <w:r>
-        <w:rPr>
-          <w:color w:val="C9211E"/>
-          <w:shd w:fill="FFFFFF" w:val="clear"/>
-        </w:rPr>
-        <w:t>stier</w:t>
-      </w:r>
-      <w:r>
-        <w:rPr>
-          <w:color w:val="C9211E"/>
-          <w:shd w:fill="FFFFFF" w:val="clear"/>
-        </w:rPr>
-        <w:t xml:space="preserve"> er det </w:t>
-      </w:r>
-      <w:r>
-        <w:rPr>
-          <w:color w:val="C9211E"/>
-          <w:shd w:fill="FFFFFF" w:val="clear"/>
-        </w:rPr>
-        <w:t xml:space="preserve">muligt  at indsætte de korrekte stier under "Indstillinger" -&gt;  "Generelle indstillinger" </w:t>
-      </w:r>
-      <w:r>
-        <w:rPr>
-          <w:color w:val="C9211E"/>
-          <w:shd w:fill="FFFFFF" w:val="clear"/>
-        </w:rPr>
-        <w:t xml:space="preserve"> </w:t>
+        <w:t xml:space="preserve">Hvis disse programmer ikke er installeret i deres default stier er det muligt  at indsætte de korrekte stier under "Indstillinger" -&gt;  "Generelle indstillinger"  </w:t>
       </w:r>
     </w:p>
     <w:p>
@@ -2572,51 +3061,71 @@
           <w:ilvl w:val="0"/>
           <w:numId w:val="2"/>
         </w:numPr>
-        <w:rPr/>
+        <w:rPr>
+          <w:color w:val="000000"/>
+        </w:rPr>
       </w:pPr>
       <w:bookmarkStart w:id="5" w:name="__RefHeading___Toc531010037"/>
       <w:bookmarkEnd w:id="5"/>
       <w:r>
-        <w:rPr/>
+        <w:rPr>
+          <w:color w:val="000000"/>
+        </w:rPr>
         <w:t>Brug af MusicXml nodearkiver på Internettet</w:t>
       </w:r>
     </w:p>
     <w:p>
       <w:pPr>
         <w:pStyle w:val="Normal"/>
-        <w:rPr/>
-      </w:pPr>
-      <w:r>
-        <w:rPr/>
-      </w:r>
-    </w:p>
-    <w:p>
-      <w:pPr>
-        <w:pStyle w:val="Normal"/>
-        <w:rPr/>
-      </w:pPr>
-      <w:r>
-        <w:rPr/>
+        <w:rPr>
+          <w:color w:val="000000"/>
+        </w:rPr>
+      </w:pPr>
+      <w:r>
+        <w:rPr>
+          <w:color w:val="000000"/>
+        </w:rPr>
+      </w:r>
+    </w:p>
+    <w:p>
+      <w:pPr>
+        <w:pStyle w:val="Normal"/>
+        <w:rPr>
+          <w:color w:val="000000"/>
+        </w:rPr>
+      </w:pPr>
+      <w:r>
+        <w:rPr>
+          <w:color w:val="000000"/>
+        </w:rPr>
         <w:t>IBOS Nodelæser indeholder direkte links til udvalgte MusicXml nodearkiver på Internettet.</w:t>
       </w:r>
     </w:p>
     <w:p>
       <w:pPr>
         <w:pStyle w:val="Normal"/>
-        <w:rPr/>
-      </w:pPr>
-      <w:r>
-        <w:rPr/>
+        <w:rPr>
+          <w:color w:val="000000"/>
+        </w:rPr>
+      </w:pPr>
+      <w:r>
+        <w:rPr>
+          <w:color w:val="000000"/>
+        </w:rPr>
         <w:t>En opdateret liste over sådanne links findes på</w:t>
       </w:r>
     </w:p>
     <w:p>
       <w:pPr>
         <w:pStyle w:val="Normal"/>
-        <w:rPr/>
-      </w:pPr>
-      <w:r>
-        <w:rPr/>
+        <w:rPr>
+          <w:color w:val="000000"/>
+        </w:rPr>
+      </w:pPr>
+      <w:r>
+        <w:rPr>
+          <w:color w:val="000000"/>
+        </w:rPr>
       </w:r>
     </w:p>
     <w:p>
@@ -2628,6 +3137,7 @@
         <w:r>
           <w:rPr>
             <w:rStyle w:val="Hyperlink"/>
+            <w:color w:val="000000"/>
           </w:rPr>
           <w:t>https://www.musicxml.com/music-in-musicxml/</w:t>
         </w:r>
@@ -2636,29 +3146,34 @@
     <w:p>
       <w:pPr>
         <w:pStyle w:val="Normal"/>
-        <w:rPr/>
-      </w:pPr>
-      <w:r>
-        <w:rPr/>
-      </w:r>
-    </w:p>
-    <w:p>
-      <w:pPr>
-        <w:pStyle w:val="Normal"/>
-        <w:rPr/>
-      </w:pPr>
-      <w:r>
-        <w:rPr/>
+        <w:rPr>
+          <w:color w:val="000000"/>
+        </w:rPr>
+      </w:pPr>
+      <w:r>
+        <w:rPr>
+          <w:color w:val="000000"/>
+        </w:rPr>
+      </w:r>
+    </w:p>
+    <w:p>
+      <w:pPr>
+        <w:pStyle w:val="Normal"/>
+        <w:rPr>
+          <w:color w:val="000000"/>
+        </w:rPr>
+      </w:pPr>
+      <w:r>
+        <w:rPr>
+          <w:color w:val="000000"/>
+        </w:rPr>
         <w:t>Se nærmere herom i Brugervejledningen.</w:t>
       </w:r>
     </w:p>
     <w:sectPr>
-      <w:headerReference w:type="default" r:id="rId7"/>
-      <w:footerReference w:type="default" r:id="rId8"/>
       <w:type w:val="continuous"/>
       <w:pgSz w:w="11906" w:h="16838"/>
       <w:pgMar w:left="1134" w:right="1134" w:header="708" w:top="1134" w:footer="1134" w:bottom="2015" w:gutter="0"/>
-      <w:pgNumType w:fmt="decimal"/>
       <w:formProt w:val="false"/>
       <w:textDirection w:val="lrTb"/>
       <w:docGrid w:type="default" w:linePitch="312" w:charSpace="0"/>
@@ -2737,90 +3252,7 @@
         <w:sz w:val="28"/>
         <w:szCs w:val="28"/>
       </w:rPr>
-      <w:t>5</w:t>
-    </w:r>
-    <w:r>
-      <w:rPr>
-        <w:sz w:val="28"/>
-        <w:szCs w:val="28"/>
-      </w:rPr>
-      <w:fldChar w:fldCharType="end"/>
-    </w:r>
-  </w:p>
-</w:ftr>
-</file>
-
-<file path=word/footer2.xml><?xml version="1.0" encoding="utf-8"?>
-<w:ftr xmlns:o="urn:schemas-microsoft-com:office:office" xmlns:r="http://schemas.openxmlformats.org/officeDocument/2006/relationships" xmlns:v="urn:schemas-microsoft-com:vml" xmlns:w="http://schemas.openxmlformats.org/wordprocessingml/2006/main" xmlns:w10="urn:schemas-microsoft-com:office:word" xmlns:wp="http://schemas.openxmlformats.org/drawingml/2006/wordprocessingDrawing" xmlns:wps="http://schemas.microsoft.com/office/word/2010/wordprocessingShape" xmlns:wpg="http://schemas.microsoft.com/office/word/2010/wordprocessingGroup" xmlns:mc="http://schemas.openxmlformats.org/markup-compatibility/2006" xmlns:wp14="http://schemas.microsoft.com/office/word/2010/wordprocessingDrawing" xmlns:w14="http://schemas.microsoft.com/office/word/2010/wordml" mc:Ignorable="w14 wp14">
-  <w:p>
-    <w:pPr>
-      <w:pStyle w:val="Sidefod"/>
-      <w:rPr>
-        <w:sz w:val="28"/>
-        <w:szCs w:val="28"/>
-      </w:rPr>
-    </w:pPr>
-    <w:r>
-      <w:rPr/>
-      <w:fldChar w:fldCharType="begin"/>
-    </w:r>
-    <w:r>
-      <w:rPr/>
-      <w:instrText> FILENAME </w:instrText>
-    </w:r>
-    <w:r>
-      <w:rPr/>
-      <w:fldChar w:fldCharType="separate"/>
-    </w:r>
-    <w:r>
-      <w:rPr/>
-      <w:t>Installationsvejledning for IBOS Nodelæser version 4.0.0.0.docx</w:t>
-    </w:r>
-    <w:r>
-      <w:rPr/>
-      <w:fldChar w:fldCharType="end"/>
-    </w:r>
-  </w:p>
-  <w:p>
-    <w:pPr>
-      <w:pStyle w:val="Sidefod"/>
-      <w:jc w:val="right"/>
-      <w:rPr/>
-    </w:pPr>
-    <w:r>
-      <w:rPr>
-        <w:sz w:val="28"/>
-        <w:szCs w:val="28"/>
-      </w:rPr>
-      <w:t xml:space="preserve">Side </w:t>
-    </w:r>
-    <w:r>
-      <w:rPr>
-        <w:sz w:val="28"/>
-        <w:szCs w:val="28"/>
-      </w:rPr>
-      <w:fldChar w:fldCharType="begin"/>
-    </w:r>
-    <w:r>
-      <w:rPr>
-        <w:sz w:val="28"/>
-        <w:szCs w:val="28"/>
-      </w:rPr>
-      <w:instrText> PAGE </w:instrText>
-    </w:r>
-    <w:r>
-      <w:rPr>
-        <w:sz w:val="28"/>
-        <w:szCs w:val="28"/>
-      </w:rPr>
-      <w:fldChar w:fldCharType="separate"/>
-    </w:r>
-    <w:r>
-      <w:rPr>
-        <w:sz w:val="28"/>
-        <w:szCs w:val="28"/>
-      </w:rPr>
-      <w:t>5</w:t>
+      <w:t>4</w:t>
     </w:r>
     <w:r>
       <w:rPr>
@@ -2834,20 +3266,6 @@
 </file>
 
 <file path=word/header1.xml><?xml version="1.0" encoding="utf-8"?>
-<w:hdr xmlns:o="urn:schemas-microsoft-com:office:office" xmlns:r="http://schemas.openxmlformats.org/officeDocument/2006/relationships" xmlns:v="urn:schemas-microsoft-com:vml" xmlns:w="http://schemas.openxmlformats.org/wordprocessingml/2006/main" xmlns:w10="urn:schemas-microsoft-com:office:word" xmlns:wp="http://schemas.openxmlformats.org/drawingml/2006/wordprocessingDrawing" xmlns:wps="http://schemas.microsoft.com/office/word/2010/wordprocessingShape" xmlns:wpg="http://schemas.microsoft.com/office/word/2010/wordprocessingGroup" xmlns:mc="http://schemas.openxmlformats.org/markup-compatibility/2006" xmlns:wp14="http://schemas.microsoft.com/office/word/2010/wordprocessingDrawing" xmlns:w14="http://schemas.microsoft.com/office/word/2010/wordml" mc:Ignorable="w14 wp14">
-  <w:p>
-    <w:pPr>
-      <w:pStyle w:val="Sidehoved"/>
-      <w:rPr/>
-    </w:pPr>
-    <w:r>
-      <w:rPr/>
-    </w:r>
-  </w:p>
-</w:hdr>
-</file>
-
-<file path=word/header2.xml><?xml version="1.0" encoding="utf-8"?>
 <w:hdr xmlns:o="urn:schemas-microsoft-com:office:office" xmlns:r="http://schemas.openxmlformats.org/officeDocument/2006/relationships" xmlns:v="urn:schemas-microsoft-com:vml" xmlns:w="http://schemas.openxmlformats.org/wordprocessingml/2006/main" xmlns:w10="urn:schemas-microsoft-com:office:word" xmlns:wp="http://schemas.openxmlformats.org/drawingml/2006/wordprocessingDrawing" xmlns:wps="http://schemas.microsoft.com/office/word/2010/wordprocessingShape" xmlns:wpg="http://schemas.microsoft.com/office/word/2010/wordprocessingGroup" xmlns:mc="http://schemas.openxmlformats.org/markup-compatibility/2006" xmlns:wp14="http://schemas.microsoft.com/office/word/2010/wordprocessingDrawing" xmlns:w14="http://schemas.microsoft.com/office/word/2010/wordml" mc:Ignorable="w14 wp14">
   <w:p>
     <w:pPr>
@@ -4001,6 +4419,21 @@
       <w:bCs/>
     </w:rPr>
   </w:style>
+  <w:style w:type="paragraph" w:styleId="TOAHeading">
+    <w:name w:val="TOA Heading"/>
+    <w:basedOn w:val="Overskrift"/>
+    <w:qFormat/>
+    <w:pPr>
+      <w:suppressLineNumbers/>
+      <w:ind w:left="0" w:hanging="0"/>
+    </w:pPr>
+    <w:rPr>
+      <w:b/>
+      <w:bCs/>
+      <w:sz w:val="32"/>
+      <w:szCs w:val="32"/>
+    </w:rPr>
+  </w:style>
   <w:style w:type="paragraph" w:styleId="Indholdsfortegnelseoverskrift">
     <w:name w:val="TOA Heading"/>
     <w:basedOn w:val="Overskrift"/>

</xml_diff>